<commit_message>
added model estimation without macro as a test
</commit_message>
<xml_diff>
--- a/paper/GaR_paper.docx
+++ b/paper/GaR_paper.docx
@@ -271,7 +271,16 @@
         <w:ind w:firstLine="284"/>
       </w:pPr>
       <w:r>
-        <w:t xml:space="preserve">In this paper, we focus on designing </w:t>
+        <w:t xml:space="preserve">In this paper, we focus on </w:t>
+      </w:r>
+      <w:r>
+        <w:t>quantifying</w:t>
+      </w:r>
+      <w:r>
+        <w:t xml:space="preserve"> systemic risks and </w:t>
+      </w:r>
+      <w:r>
+        <w:t xml:space="preserve">designing </w:t>
       </w:r>
       <w:r>
         <w:t>a policy rule for macroprudential policy</w:t>
@@ -286,7 +295,181 @@
         <w:t xml:space="preserve"> </w:t>
       </w:r>
       <w:r>
-        <w:t xml:space="preserve">To estimate the effects of </w:t>
+        <w:t>W</w:t>
+      </w:r>
+      <w:r>
+        <w:t xml:space="preserve">e </w:t>
+      </w:r>
+      <w:r>
+        <w:t>distinguish</w:t>
+      </w:r>
+      <w:r>
+        <w:t xml:space="preserve"> </w:t>
+      </w:r>
+      <w:r>
+        <w:t xml:space="preserve">between two types of </w:t>
+      </w:r>
+      <w:r>
+        <w:t>systemic risks</w:t>
+      </w:r>
+      <w:r>
+        <w:t xml:space="preserve">, </w:t>
+      </w:r>
+      <w:r>
+        <w:t>financial vulnerability</w:t>
+      </w:r>
+      <w:r>
+        <w:t xml:space="preserve"> and </w:t>
+      </w:r>
+      <w:r>
+        <w:t>financial stress</w:t>
+      </w:r>
+      <w:r>
+        <w:t xml:space="preserve">. </w:t>
+      </w:r>
+      <w:r>
+        <w:t>To measure the effects of</w:t>
+      </w:r>
+      <w:r>
+        <w:t xml:space="preserve"> </w:t>
+      </w:r>
+      <w:r>
+        <w:t>financial vulnerability</w:t>
+      </w:r>
+      <w:r>
+        <w:t xml:space="preserve"> </w:t>
+      </w:r>
+      <w:r>
+        <w:t xml:space="preserve">the </w:t>
+      </w:r>
+      <w:r>
+        <w:t>financial cycle index</w:t>
+      </w:r>
+      <w:r>
+        <w:t xml:space="preserve"> (FCyI)</w:t>
+      </w:r>
+      <w:r>
+        <w:t xml:space="preserve"> </w:t>
+      </w:r>
+      <w:sdt>
+        <w:sdtPr>
+          <w:id w:val="-1150128943"/>
+          <w:citation/>
+        </w:sdtPr>
+        <w:sdtContent>
+          <w:r>
+            <w:fldChar w:fldCharType="begin"/>
+          </w:r>
+          <w:r>
+            <w:instrText xml:space="preserve"> CITATION Hol12 \l 1033 </w:instrText>
+          </w:r>
+          <w:r>
+            <w:fldChar w:fldCharType="separate"/>
+          </w:r>
+          <w:r>
+            <w:rPr>
+              <w:noProof/>
+            </w:rPr>
+            <w:t>(Holló, Kremer, &amp; Lo Duca, 2012)</w:t>
+          </w:r>
+          <w:r>
+            <w:fldChar w:fldCharType="end"/>
+          </w:r>
+        </w:sdtContent>
+      </w:sdt>
+      <w:sdt>
+        <w:sdtPr>
+          <w:id w:val="1875962122"/>
+          <w:citation/>
+        </w:sdtPr>
+        <w:sdtContent>
+          <w:r>
+            <w:fldChar w:fldCharType="begin"/>
+          </w:r>
+          <w:r>
+            <w:instrText xml:space="preserve"> CITATION Pla14 \l 1033 </w:instrText>
+          </w:r>
+          <w:r>
+            <w:fldChar w:fldCharType="separate"/>
+          </w:r>
+          <w:r>
+            <w:rPr>
+              <w:noProof/>
+            </w:rPr>
+            <w:t xml:space="preserve"> (Plašil, Seidler, Hlaváč, &amp; Konečný, 2014)</w:t>
+          </w:r>
+          <w:r>
+            <w:fldChar w:fldCharType="end"/>
+          </w:r>
+        </w:sdtContent>
+      </w:sdt>
+      <w:r>
+        <w:t xml:space="preserve"> is used.</w:t>
+      </w:r>
+      <w:r>
+        <w:t xml:space="preserve"> </w:t>
+      </w:r>
+      <w:r>
+        <w:t xml:space="preserve">While, to </w:t>
+      </w:r>
+      <w:r>
+        <w:t>measure</w:t>
+      </w:r>
+      <w:r>
+        <w:t xml:space="preserve"> </w:t>
+      </w:r>
+      <w:r>
+        <w:t>financial stress</w:t>
+      </w:r>
+      <w:r>
+        <w:t xml:space="preserve">, we use </w:t>
+      </w:r>
+      <w:r>
+        <w:t xml:space="preserve">the </w:t>
+      </w:r>
+      <w:r>
+        <w:t>financial conditions index</w:t>
+      </w:r>
+      <w:r>
+        <w:t xml:space="preserve"> (FCI)</w:t>
+      </w:r>
+      <w:r>
+        <w:t xml:space="preserve"> </w:t>
+      </w:r>
+      <w:sdt>
+        <w:sdtPr>
+          <w:id w:val="-1233158311"/>
+          <w:citation/>
+        </w:sdtPr>
+        <w:sdtContent>
+          <w:r>
+            <w:fldChar w:fldCharType="begin"/>
+          </w:r>
+          <w:r>
+            <w:instrText xml:space="preserve"> CITATION Koo14 \l 1033 </w:instrText>
+          </w:r>
+          <w:r>
+            <w:fldChar w:fldCharType="separate"/>
+          </w:r>
+          <w:r>
+            <w:rPr>
+              <w:noProof/>
+            </w:rPr>
+            <w:t>(Koop &amp; Korobilis, 2014)</w:t>
+          </w:r>
+          <w:r>
+            <w:fldChar w:fldCharType="end"/>
+          </w:r>
+        </w:sdtContent>
+      </w:sdt>
+      <w:r>
+        <w:t xml:space="preserve">. </w:t>
+      </w:r>
+      <w:r>
+        <w:t>Finally, to</w:t>
+      </w:r>
+      <w:r>
+        <w:t xml:space="preserve"> estimate the effects of </w:t>
       </w:r>
       <w:r>
         <w:t>macroprudential policy</w:t>
@@ -365,10 +548,28 @@
         <w:t>opts to construct</w:t>
       </w:r>
       <w:r>
-        <w:t xml:space="preserve">ing an index given </w:t>
-      </w:r>
-      <w:r>
-        <w:t xml:space="preserve">the history and the macroprudential policy </w:t>
+        <w:t>ing a</w:t>
+      </w:r>
+      <w:r>
+        <w:t xml:space="preserve"> </w:t>
+      </w:r>
+      <w:r>
+        <w:t>macroprudential policy</w:t>
+      </w:r>
+      <w:r>
+        <w:t xml:space="preserve"> </w:t>
+      </w:r>
+      <w:r>
+        <w:t>index</w:t>
+      </w:r>
+      <w:r>
+        <w:t xml:space="preserve"> (MPI) </w:t>
+      </w:r>
+      <w:r>
+        <w:t xml:space="preserve">given </w:t>
+      </w:r>
+      <w:r>
+        <w:t xml:space="preserve">the history and the macroprudential </w:t>
       </w:r>
       <w:r>
         <w:t>stance</w:t>
@@ -380,7 +581,11 @@
         <w:t>Unfortunately</w:t>
       </w:r>
       <w:r>
-        <w:t>, like many countries, the data related to macroprudential policy in Armenian is quite limited</w:t>
+        <w:t xml:space="preserve">, like many countries, the data related to </w:t>
+      </w:r>
+      <w:r>
+        <w:lastRenderedPageBreak/>
+        <w:t>macroprudential policy in Armenian is quite limited</w:t>
       </w:r>
       <w:r>
         <w:t xml:space="preserve">. To account for this, we use a two-step approach. First, we estimate a panel quantile regression very close in its logic and spirit to </w:t>
@@ -403,15 +608,36 @@
         <w:t xml:space="preserve">dataset with </w:t>
       </w:r>
       <w:r>
-        <w:t xml:space="preserve">43 countries and </w:t>
-      </w:r>
-      <w:r>
-        <w:t>21</w:t>
+        <w:t>4</w:t>
+      </w:r>
+      <w:r>
+        <w:t>1</w:t>
+      </w:r>
+      <w:r>
+        <w:t xml:space="preserve"> countries and </w:t>
+      </w:r>
+      <w:r>
+        <w:t>15</w:t>
       </w:r>
       <w:r>
         <w:t xml:space="preserve"> variables</w:t>
       </w:r>
       <w:r>
+        <w:t xml:space="preserve"> (18 with </w:t>
+      </w:r>
+      <w:r>
+        <w:t>interaction</w:t>
+      </w:r>
+      <w:r>
+        <w:t xml:space="preserve"> </w:t>
+      </w:r>
+      <w:r>
+        <w:t>effects</w:t>
+      </w:r>
+      <w:r>
+        <w:t>)</w:t>
+      </w:r>
+      <w:r>
         <w:t xml:space="preserve"> for the period 1993-2023</w:t>
       </w:r>
       <w:r>
@@ -430,62 +656,85 @@
         <w:t xml:space="preserve">output growth. </w:t>
       </w:r>
       <w:r>
-        <w:t xml:space="preserve">The reason we focus </w:t>
-      </w:r>
-      <w:r>
-        <w:lastRenderedPageBreak/>
-        <w:t xml:space="preserve">on the </w:t>
+        <w:t xml:space="preserve">The reason we focus on the </w:t>
       </w:r>
       <w:r>
         <w:t>g</w:t>
       </w:r>
       <w:r>
-        <w:t>ross domestic product</w:t>
+        <w:t xml:space="preserve">ross domestic product </w:t>
+      </w:r>
+      <w:r>
+        <w:t xml:space="preserve">(GDP) growth, is because it is closely related to the performance of the financial system and is a good measure for </w:t>
+      </w:r>
+      <w:r>
+        <w:t>quantifying</w:t>
+      </w:r>
+      <w:r>
+        <w:t xml:space="preserve"> the </w:t>
+      </w:r>
+      <w:r>
+        <w:t>vulnerabilities</w:t>
+      </w:r>
+      <w:r>
+        <w:t xml:space="preserve"> and </w:t>
+      </w:r>
+      <w:r>
+        <w:t>potential losses</w:t>
+      </w:r>
+      <w:r>
+        <w:t xml:space="preserve">. </w:t>
+      </w:r>
+      <w:r>
+        <w:t>Next, we estimate a</w:t>
+      </w:r>
+      <w:r>
+        <w:t xml:space="preserve"> similar, but</w:t>
+      </w:r>
+      <w:r>
+        <w:t xml:space="preserve"> local </w:t>
+      </w:r>
+      <w:r>
+        <w:t xml:space="preserve">quantile regression </w:t>
+      </w:r>
+      <w:r>
+        <w:t xml:space="preserve">model </w:t>
+      </w:r>
+      <w:r>
+        <w:t xml:space="preserve">for Armenia, </w:t>
+      </w:r>
+      <w:r>
+        <w:t xml:space="preserve">with </w:t>
+      </w:r>
+      <w:r>
+        <w:t>10</w:t>
+      </w:r>
+      <w:r>
+        <w:t xml:space="preserve"> variables</w:t>
+      </w:r>
+      <w:r>
+        <w:t xml:space="preserve"> (13 </w:t>
+      </w:r>
+      <w:r>
+        <w:t>with</w:t>
       </w:r>
       <w:r>
         <w:t xml:space="preserve"> </w:t>
       </w:r>
       <w:r>
-        <w:t xml:space="preserve">(GDP) growth, is because it is closely related to the performance of the financial system and is a good measure for </w:t>
-      </w:r>
-      <w:r>
-        <w:t>quantifying</w:t>
-      </w:r>
-      <w:r>
-        <w:t xml:space="preserve"> the </w:t>
-      </w:r>
-      <w:r>
-        <w:t>vulnerabilities</w:t>
-      </w:r>
-      <w:r>
-        <w:t xml:space="preserve"> and </w:t>
-      </w:r>
-      <w:r>
-        <w:t>potential losses</w:t>
-      </w:r>
-      <w:r>
-        <w:t xml:space="preserve">. </w:t>
-      </w:r>
-      <w:r>
-        <w:t>Next, we estimate a</w:t>
-      </w:r>
-      <w:r>
-        <w:t xml:space="preserve"> similar, but</w:t>
-      </w:r>
-      <w:r>
-        <w:t xml:space="preserve"> local </w:t>
-      </w:r>
-      <w:r>
-        <w:t xml:space="preserve">quantile regression </w:t>
-      </w:r>
-      <w:r>
-        <w:t xml:space="preserve">model </w:t>
-      </w:r>
-      <w:r>
-        <w:t xml:space="preserve">for Armenia, </w:t>
-      </w:r>
-      <w:r>
-        <w:t xml:space="preserve">with 11 variables for the period 2003-2024 </w:t>
+        <w:t>interaction</w:t>
+      </w:r>
+      <w:r>
+        <w:t xml:space="preserve"> </w:t>
+      </w:r>
+      <w:r>
+        <w:t>effects</w:t>
+      </w:r>
+      <w:r>
+        <w:t>)</w:t>
+      </w:r>
+      <w:r>
+        <w:t xml:space="preserve"> for the period 2003-2024 </w:t>
       </w:r>
       <w:r>
         <w:t xml:space="preserve">including the limited macroprudential data. Finally, we use the results from the panel model to improve the </w:t>
@@ -505,7 +754,558 @@
         <w:ind w:firstLine="284"/>
       </w:pPr>
       <w:r>
-        <w:t xml:space="preserve">According to the results, macroprudential policy </w:t>
+        <w:t xml:space="preserve">It is important to note that the effect of macroprudential policy also depends other economic conditions. </w:t>
+      </w:r>
+      <w:r>
+        <w:t xml:space="preserve">The effectiveness of the policy may vary depending on the current buildup of </w:t>
+      </w:r>
+      <w:r>
+        <w:t>vulnerabilit</w:t>
+      </w:r>
+      <w:r>
+        <w:t>ies (</w:t>
+      </w:r>
+      <w:r>
+        <w:t>position in the financial</w:t>
+      </w:r>
+      <w:r>
+        <w:t xml:space="preserve"> </w:t>
+      </w:r>
+      <w:r>
+        <w:t>cycle</w:t>
+      </w:r>
+      <w:r>
+        <w:t xml:space="preserve">) and the level of </w:t>
+      </w:r>
+      <w:r>
+        <w:t>financial stress</w:t>
+      </w:r>
+      <w:r>
+        <w:t xml:space="preserve"> (before, during and after a </w:t>
+      </w:r>
+      <w:r>
+        <w:t>crisis</w:t>
+      </w:r>
+      <w:r>
+        <w:t>).</w:t>
+      </w:r>
+      <w:r>
+        <w:t xml:space="preserve"> </w:t>
+      </w:r>
+      <w:r>
+        <w:t>The</w:t>
+      </w:r>
+      <w:r>
+        <w:t xml:space="preserve"> </w:t>
+      </w:r>
+      <w:r>
+        <w:t>FCyI</w:t>
+      </w:r>
+      <w:r>
+        <w:t xml:space="preserve"> is an extension to the </w:t>
+      </w:r>
+      <w:r>
+        <w:t>Basel credit-to-GDP</w:t>
+      </w:r>
+      <w:r>
+        <w:t xml:space="preserve"> gap approach</w:t>
+      </w:r>
+      <w:r>
+        <w:t xml:space="preserve"> that also includes elements from m</w:t>
+      </w:r>
+      <w:r>
+        <w:t>ortgage</w:t>
+      </w:r>
+      <w:r>
+        <w:t xml:space="preserve"> markets, </w:t>
+      </w:r>
+      <w:r>
+        <w:t>property prices</w:t>
+      </w:r>
+      <w:r>
+        <w:t xml:space="preserve"> and the t</w:t>
+      </w:r>
+      <w:r>
+        <w:t>rade</w:t>
+      </w:r>
+      <w:r>
+        <w:t xml:space="preserve"> </w:t>
+      </w:r>
+      <w:r>
+        <w:t>deficit</w:t>
+      </w:r>
+      <w:r>
+        <w:t>.</w:t>
+      </w:r>
+      <w:r>
+        <w:t xml:space="preserve"> It </w:t>
+      </w:r>
+      <w:r>
+        <w:t>serve</w:t>
+      </w:r>
+      <w:r>
+        <w:t xml:space="preserve">s as a leading indicator for future </w:t>
+      </w:r>
+      <w:r>
+        <w:t>deteriorations</w:t>
+      </w:r>
+      <w:r>
+        <w:t xml:space="preserve"> in GDP growth.</w:t>
+      </w:r>
+      <w:r>
+        <w:t xml:space="preserve"> </w:t>
+      </w:r>
+      <w:r>
+        <w:t>On the other hand</w:t>
+      </w:r>
+      <w:r>
+        <w:t>, the FCI</w:t>
+      </w:r>
+      <w:r>
+        <w:t xml:space="preserve"> follow</w:t>
+      </w:r>
+      <w:r>
+        <w:t>s</w:t>
+      </w:r>
+      <w:r>
+        <w:t xml:space="preserve"> the methodology </w:t>
+      </w:r>
+      <w:r>
+        <w:t>proposed</w:t>
+      </w:r>
+      <w:r>
+        <w:t xml:space="preserve"> </w:t>
+      </w:r>
+      <w:r>
+        <w:t xml:space="preserve">by </w:t>
+      </w:r>
+      <w:r>
+        <w:t xml:space="preserve">Gary Koop and </w:t>
+      </w:r>
+      <w:r>
+        <w:t xml:space="preserve">Dimitris </w:t>
+      </w:r>
+      <w:proofErr w:type="spellStart"/>
+      <w:r>
+        <w:t>Korobilis</w:t>
+      </w:r>
+      <w:proofErr w:type="spellEnd"/>
+      <w:r>
+        <w:t xml:space="preserve"> (2014). A factor augmented vector autoregressive model with time-varying coefficients and stochastic volatility is used </w:t>
+      </w:r>
+      <w:r>
+        <w:t xml:space="preserve">to </w:t>
+      </w:r>
+      <w:r>
+        <w:t>aggregate</w:t>
+      </w:r>
+      <w:r>
+        <w:t xml:space="preserve"> the</w:t>
+      </w:r>
+      <w:r>
+        <w:t xml:space="preserve"> </w:t>
+      </w:r>
+      <w:r>
+        <w:t>financial variables</w:t>
+      </w:r>
+      <w:r>
+        <w:t xml:space="preserve"> into a single</w:t>
+      </w:r>
+      <w:r>
+        <w:t xml:space="preserve"> index. </w:t>
+      </w:r>
+      <w:r>
+        <w:t xml:space="preserve">The index focuses on the interest rate markets, thus reflecting the current and future </w:t>
+      </w:r>
+      <w:r>
+        <w:t xml:space="preserve">expectations </w:t>
+      </w:r>
+      <w:r>
+        <w:t>on</w:t>
+      </w:r>
+      <w:r>
+        <w:t xml:space="preserve"> growth</w:t>
+      </w:r>
+      <w:r>
+        <w:t>.</w:t>
+      </w:r>
+      <w:r>
+        <w:t xml:space="preserve"> </w:t>
+      </w:r>
+      <w:r>
+        <w:t>F</w:t>
+      </w:r>
+      <w:r>
+        <w:t>inancial vulnerabilit</w:t>
+      </w:r>
+      <w:r>
+        <w:t>ies are risks that are realized during f</w:t>
+      </w:r>
+      <w:r>
+        <w:t>inancial stress</w:t>
+      </w:r>
+      <w:r>
+        <w:t xml:space="preserve">, as such, these two </w:t>
+      </w:r>
+      <w:r>
+        <w:t>indices</w:t>
+      </w:r>
+      <w:r>
+        <w:t xml:space="preserve"> are </w:t>
+      </w:r>
+      <w:r>
+        <w:t xml:space="preserve">also </w:t>
+      </w:r>
+      <w:r>
+        <w:t>tightly related.</w:t>
+      </w:r>
+      <w:r>
+        <w:t xml:space="preserve"> </w:t>
+      </w:r>
+      <w:r>
+        <w:t>To account for the relationship</w:t>
+      </w:r>
+      <w:r>
+        <w:t>s</w:t>
+      </w:r>
+      <w:r>
+        <w:t xml:space="preserve"> between </w:t>
+      </w:r>
+      <w:r>
+        <w:t xml:space="preserve">the </w:t>
+      </w:r>
+      <w:r>
+        <w:t>variables</w:t>
+      </w:r>
+      <w:r>
+        <w:t xml:space="preserve">, we also include </w:t>
+      </w:r>
+      <w:r>
+        <w:t xml:space="preserve">3 interaction terms in the models. These are the </w:t>
+      </w:r>
+      <w:r>
+        <w:t>product</w:t>
+      </w:r>
+      <w:r>
+        <w:t xml:space="preserve"> between FCyI and FCI (both </w:t>
+      </w:r>
+      <w:r>
+        <w:t>normalized</w:t>
+      </w:r>
+      <w:r>
+        <w:t>)</w:t>
+      </w:r>
+      <w:r>
+        <w:t xml:space="preserve">, aka the </w:t>
+      </w:r>
+      <w:r>
+        <w:t>crisis index</w:t>
+      </w:r>
+      <w:r>
+        <w:t xml:space="preserve"> (CI)</w:t>
+      </w:r>
+      <w:r>
+        <w:t xml:space="preserve">, </w:t>
+      </w:r>
+      <w:r>
+        <w:t>the product</w:t>
+      </w:r>
+      <w:r>
+        <w:t xml:space="preserve"> between MPI and </w:t>
+      </w:r>
+      <w:r>
+        <w:t>FCyI</w:t>
+      </w:r>
+      <w:r>
+        <w:t xml:space="preserve"> (</w:t>
+      </w:r>
+      <w:r>
+        <w:t>FCyI</w:t>
+      </w:r>
+      <w:r>
+        <w:t xml:space="preserve"> </w:t>
+      </w:r>
+      <w:r>
+        <w:t>normalized</w:t>
+      </w:r>
+      <w:r>
+        <w:t>)</w:t>
+      </w:r>
+      <w:r>
+        <w:t xml:space="preserve">, </w:t>
+      </w:r>
+      <w:r>
+        <w:t>the</w:t>
+      </w:r>
+      <w:r>
+        <w:t xml:space="preserve"> </w:t>
+      </w:r>
+      <w:r>
+        <w:t>c</w:t>
+      </w:r>
+      <w:r>
+        <w:t>ycle-</w:t>
+      </w:r>
+      <w:r>
+        <w:t>b</w:t>
+      </w:r>
+      <w:r>
+        <w:t xml:space="preserve">ased </w:t>
+      </w:r>
+      <w:r>
+        <w:t>p</w:t>
+      </w:r>
+      <w:r>
+        <w:t xml:space="preserve">olicy </w:t>
+      </w:r>
+      <w:r>
+        <w:t>a</w:t>
+      </w:r>
+      <w:r>
+        <w:t>djustment</w:t>
+      </w:r>
+      <w:r>
+        <w:t xml:space="preserve"> (</w:t>
+      </w:r>
+      <w:proofErr w:type="spellStart"/>
+      <w:r>
+        <w:t>CyBPA</w:t>
+      </w:r>
+      <w:proofErr w:type="spellEnd"/>
+      <w:r>
+        <w:t>)</w:t>
+      </w:r>
+      <w:r>
+        <w:t xml:space="preserve"> and the </w:t>
+      </w:r>
+      <w:r>
+        <w:t>product</w:t>
+      </w:r>
+      <w:r>
+        <w:t xml:space="preserve"> </w:t>
+      </w:r>
+      <w:r>
+        <w:t>between MPI and FCI</w:t>
+      </w:r>
+      <w:r>
+        <w:t xml:space="preserve"> </w:t>
+      </w:r>
+      <w:r>
+        <w:t xml:space="preserve">(FCI </w:t>
+      </w:r>
+      <w:r>
+        <w:t>normalized</w:t>
+      </w:r>
+      <w:r>
+        <w:t>)</w:t>
+      </w:r>
+      <w:r>
+        <w:t xml:space="preserve">, the </w:t>
+      </w:r>
+      <w:r>
+        <w:t>conditions</w:t>
+      </w:r>
+      <w:r>
+        <w:t>-based policy adjustment</w:t>
+      </w:r>
+      <w:r>
+        <w:t xml:space="preserve"> (</w:t>
+      </w:r>
+      <w:r>
+        <w:t>CBPA</w:t>
+      </w:r>
+      <w:r>
+        <w:t>)</w:t>
+      </w:r>
+      <w:r>
+        <w:t>.</w:t>
+      </w:r>
+    </w:p>
+    <w:p>
+      <w:pPr>
+        <w:ind w:firstLine="284"/>
+      </w:pPr>
+      <w:r>
+        <w:t xml:space="preserve">According to the results, </w:t>
+      </w:r>
+      <w:r>
+        <w:t xml:space="preserve">the FCyI has negative effects on the future GDP growth, while its effects on the current growth remain positive. </w:t>
+      </w:r>
+      <w:r>
+        <w:t xml:space="preserve">An increase in FCyI indicates higher </w:t>
+      </w:r>
+      <w:r>
+        <w:t>vulnerabilit</w:t>
+      </w:r>
+      <w:r>
+        <w:t>ies, thus t</w:t>
+      </w:r>
+      <w:r>
+        <w:t xml:space="preserve">his relationship is best </w:t>
+      </w:r>
+      <w:r>
+        <w:t>characterized</w:t>
+      </w:r>
+      <w:r>
+        <w:t xml:space="preserve"> by</w:t>
+      </w:r>
+      <w:r>
+        <w:t xml:space="preserve"> a</w:t>
+      </w:r>
+      <w:r>
+        <w:t xml:space="preserve"> l</w:t>
+      </w:r>
+      <w:r>
+        <w:t>everaged bubble</w:t>
+      </w:r>
+      <w:r>
+        <w:t xml:space="preserve"> </w:t>
+      </w:r>
+      <w:sdt>
+        <w:sdtPr>
+          <w:id w:val="-1408912909"/>
+          <w:citation/>
+        </w:sdtPr>
+        <w:sdtContent>
+          <w:r>
+            <w:fldChar w:fldCharType="begin"/>
+          </w:r>
+          <w:r>
+            <w:instrText xml:space="preserve"> CITATION Jor15 \l 1033 </w:instrText>
+          </w:r>
+          <w:r>
+            <w:fldChar w:fldCharType="separate"/>
+          </w:r>
+          <w:r>
+            <w:rPr>
+              <w:noProof/>
+            </w:rPr>
+            <w:t>(Jordà, Schularick, &amp; Taylor, 2015)</w:t>
+          </w:r>
+          <w:r>
+            <w:fldChar w:fldCharType="end"/>
+          </w:r>
+        </w:sdtContent>
+      </w:sdt>
+      <w:r>
+        <w:t xml:space="preserve">, that may emerge from </w:t>
+      </w:r>
+      <w:r>
+        <w:t xml:space="preserve">positive </w:t>
+      </w:r>
+      <w:r>
+        <w:t>feedback</w:t>
+      </w:r>
+      <w:r>
+        <w:t xml:space="preserve"> </w:t>
+      </w:r>
+      <w:r>
+        <w:t xml:space="preserve">loops between </w:t>
+      </w:r>
+      <w:r>
+        <w:t>credit growth</w:t>
+      </w:r>
+      <w:r>
+        <w:t xml:space="preserve"> </w:t>
+      </w:r>
+      <w:r>
+        <w:t xml:space="preserve">and asset prices, and </w:t>
+      </w:r>
+      <w:r>
+        <w:t>upon collapse</w:t>
+      </w:r>
+      <w:r>
+        <w:t xml:space="preserve"> </w:t>
+      </w:r>
+      <w:r>
+        <w:t>create a</w:t>
+      </w:r>
+      <w:r>
+        <w:t xml:space="preserve"> </w:t>
+      </w:r>
+      <w:r>
+        <w:t>severe</w:t>
+      </w:r>
+      <w:r>
+        <w:t xml:space="preserve"> </w:t>
+      </w:r>
+      <w:r>
+        <w:t>recession</w:t>
+      </w:r>
+      <w:r>
+        <w:t xml:space="preserve"> </w:t>
+      </w:r>
+      <w:r>
+        <w:t>with</w:t>
+      </w:r>
+      <w:r>
+        <w:t xml:space="preserve"> </w:t>
+      </w:r>
+      <w:r>
+        <w:t>slower recover</w:t>
+      </w:r>
+      <w:r>
+        <w:t>y</w:t>
+      </w:r>
+      <w:r>
+        <w:t>.</w:t>
+      </w:r>
+    </w:p>
+    <w:p>
+      <w:pPr>
+        <w:ind w:firstLine="284"/>
+      </w:pPr>
+      <w:r>
+        <w:lastRenderedPageBreak/>
+        <w:t xml:space="preserve">Meanwhile, </w:t>
+      </w:r>
+      <w:r>
+        <w:t>an</w:t>
+      </w:r>
+      <w:r>
+        <w:t xml:space="preserve"> </w:t>
+      </w:r>
+      <w:r>
+        <w:t xml:space="preserve">increase in </w:t>
+      </w:r>
+      <w:r>
+        <w:t xml:space="preserve">FCI </w:t>
+      </w:r>
+      <w:r>
+        <w:t xml:space="preserve">indicates higher </w:t>
+      </w:r>
+      <w:r>
+        <w:t>financial stress</w:t>
+      </w:r>
+      <w:r>
+        <w:t>. The w</w:t>
+      </w:r>
+      <w:r>
+        <w:t>orsening</w:t>
+      </w:r>
+      <w:r>
+        <w:t xml:space="preserve"> of the financial conditions negatively affects current GDP growth, while its effects on future growth are positive</w:t>
+      </w:r>
+      <w:r>
+        <w:t xml:space="preserve"> </w:t>
+      </w:r>
+      <w:r>
+        <w:t xml:space="preserve">(yet </w:t>
+      </w:r>
+      <w:r>
+        <w:t>insignificant</w:t>
+      </w:r>
+      <w:r>
+        <w:t xml:space="preserve"> in the local model</w:t>
+      </w:r>
+      <w:r>
+        <w:t>)</w:t>
+      </w:r>
+      <w:r>
+        <w:t xml:space="preserve">. Finally, </w:t>
+      </w:r>
+      <w:r>
+        <w:t xml:space="preserve">macroprudential policy </w:t>
       </w:r>
       <w:r>
         <w:t xml:space="preserve">has nonlinear effects on the </w:t>
@@ -657,7 +1457,10 @@
         <w:t>the</w:t>
       </w:r>
       <w:r>
-        <w:t xml:space="preserve"> distribution).</w:t>
+        <w:t xml:space="preserve"> distribution)</w:t>
+      </w:r>
+      <w:r>
+        <w:t>.</w:t>
       </w:r>
     </w:p>
     <w:p>
@@ -665,150 +1468,94 @@
         <w:ind w:firstLine="284"/>
       </w:pPr>
       <w:r>
-        <w:t xml:space="preserve">It is important to note that the effect of macroprudential policy also depends </w:t>
-      </w:r>
-      <w:r>
-        <w:t xml:space="preserve">other economic conditions. </w:t>
-      </w:r>
-      <w:r>
-        <w:t xml:space="preserve">In this paper we </w:t>
-      </w:r>
-      <w:r>
-        <w:t>distinguish</w:t>
-      </w:r>
-      <w:r>
-        <w:t xml:space="preserve"> two main indicators, </w:t>
-      </w:r>
-      <w:r>
-        <w:t>financial vulnerability</w:t>
-      </w:r>
-      <w:r>
-        <w:t xml:space="preserve"> and </w:t>
-      </w:r>
-      <w:r>
-        <w:t>financial stress</w:t>
-      </w:r>
-      <w:r>
-        <w:t xml:space="preserve">. </w:t>
-      </w:r>
-      <w:r>
-        <w:t xml:space="preserve">To measure the </w:t>
-      </w:r>
-      <w:r>
-        <w:t>financial</w:t>
-      </w:r>
-      <w:r>
-        <w:t xml:space="preserve"> vulnerabilit</w:t>
-      </w:r>
-      <w:r>
-        <w:t xml:space="preserve">y in the system we use the </w:t>
-      </w:r>
-      <w:r>
-        <w:t>financial cycle index</w:t>
-      </w:r>
-      <w:r>
-        <w:t xml:space="preserve"> (FCyI), which is an extension to the </w:t>
-      </w:r>
-      <w:r>
-        <w:t>Basel credit-to-GDP</w:t>
-      </w:r>
-      <w:r>
-        <w:t xml:space="preserve"> gap approach. </w:t>
-      </w:r>
-      <w:r>
-        <w:t>On the other hand, to measure f</w:t>
-      </w:r>
-      <w:r>
-        <w:t>inancial stress</w:t>
-      </w:r>
-      <w:r>
-        <w:t xml:space="preserve">, we estimate a </w:t>
-      </w:r>
-      <w:r>
-        <w:t>financial conditions index</w:t>
-      </w:r>
-      <w:r>
-        <w:t xml:space="preserve"> (FCI) following the methodology by Gary Koop and </w:t>
-      </w:r>
-      <w:r>
-        <w:t xml:space="preserve">Dimitris </w:t>
-      </w:r>
-      <w:proofErr w:type="spellStart"/>
-      <w:r>
-        <w:t>Korobilis</w:t>
-      </w:r>
-      <w:proofErr w:type="spellEnd"/>
-      <w:r>
-        <w:t xml:space="preserve"> (2014). A factor augmented vector autoregressive model with time-varying coefficients and stochastic volatility is used with 17 financial variables that are </w:t>
-      </w:r>
-      <w:r>
-        <w:t>aggregated</w:t>
-      </w:r>
-      <w:r>
-        <w:t xml:space="preserve"> to form the index. F</w:t>
-      </w:r>
-      <w:r>
-        <w:t>inancial vulnerabilit</w:t>
-      </w:r>
-      <w:r>
-        <w:t>ies</w:t>
+        <w:t>Using this framework, it is possible to perform conditional forecasts for the median and the tail</w:t>
       </w:r>
       <w:r>
         <w:t xml:space="preserve"> </w:t>
       </w:r>
       <w:r>
-        <w:t>are</w:t>
+        <w:t xml:space="preserve">of the GDP </w:t>
+      </w:r>
+      <w:r>
+        <w:t>distribution</w:t>
+      </w:r>
+      <w:r>
+        <w:t xml:space="preserve">. We also </w:t>
+      </w:r>
+      <w:r>
+        <w:t>refer to</w:t>
       </w:r>
       <w:r>
         <w:t xml:space="preserve"> </w:t>
       </w:r>
       <w:r>
-        <w:t>risk</w:t>
-      </w:r>
-      <w:r>
-        <w:t>s</w:t>
-      </w:r>
-      <w:r>
-        <w:t xml:space="preserve"> that </w:t>
-      </w:r>
-      <w:r>
-        <w:t>are</w:t>
-      </w:r>
-      <w:r>
-        <w:t xml:space="preserve"> realized during f</w:t>
-      </w:r>
-      <w:r>
-        <w:t>inancial stress</w:t>
-      </w:r>
-      <w:r>
-        <w:t xml:space="preserve">, as such, these two </w:t>
-      </w:r>
-      <w:r>
-        <w:t>indices</w:t>
-      </w:r>
-      <w:r>
-        <w:t xml:space="preserve"> are tightly related</w:t>
-      </w:r>
-      <w:r>
-        <w:t xml:space="preserve">. To account for the relationship between them, </w:t>
-      </w:r>
-      <w:r>
-        <w:t xml:space="preserve">we also include </w:t>
-      </w:r>
-      <w:r>
-        <w:t>their product, aka the “</w:t>
-      </w:r>
-      <w:r>
-        <w:t>crisis index</w:t>
-      </w:r>
-      <w:r>
-        <w:t>”</w:t>
-      </w:r>
-      <w:r>
-        <w:t xml:space="preserve"> (CI)</w:t>
-      </w:r>
-      <w:r>
-        <w:t xml:space="preserve"> as part of the control variables in the model.</w:t>
+        <w:t xml:space="preserve">the difference between the </w:t>
+      </w:r>
+      <w:r>
+        <w:t xml:space="preserve">median </w:t>
+      </w:r>
+      <w:r>
+        <w:t xml:space="preserve">and tail as distance-to-tail </w:t>
+      </w:r>
+      <w:r>
+        <w:t xml:space="preserve">or </w:t>
+      </w:r>
+      <w:r>
+        <w:t>Gap</w:t>
+      </w:r>
+      <w:r>
+        <w:t xml:space="preserve">. By </w:t>
+      </w:r>
+      <w:r>
+        <w:t>tightening</w:t>
+      </w:r>
+      <w:r>
+        <w:t xml:space="preserve"> the MPI</w:t>
+      </w:r>
+      <w:r>
+        <w:t xml:space="preserve">, we </w:t>
+      </w:r>
+      <w:r>
+        <w:t xml:space="preserve">reduce the median, while also </w:t>
+      </w:r>
+      <w:r>
+        <w:t>reduc</w:t>
+      </w:r>
+      <w:r>
+        <w:t xml:space="preserve">ing </w:t>
+      </w:r>
+      <w:r>
+        <w:t xml:space="preserve">the </w:t>
+      </w:r>
+      <w:r>
+        <w:t>Gap</w:t>
+      </w:r>
+      <w:r>
+        <w:t>.</w:t>
+      </w:r>
+      <w:r>
+        <w:t xml:space="preserve"> </w:t>
+      </w:r>
+      <w:r>
+        <w:t xml:space="preserve">The benefits of this </w:t>
+      </w:r>
+      <w:r>
+        <w:t>trade-off</w:t>
+      </w:r>
+      <w:r>
+        <w:t xml:space="preserve"> for the </w:t>
+      </w:r>
+      <w:r>
+        <w:t>policymaker</w:t>
+      </w:r>
+      <w:r>
+        <w:t xml:space="preserve"> will depend on their definition of </w:t>
+      </w:r>
+      <w:r>
+        <w:t>welfare</w:t>
+      </w:r>
+      <w:r>
+        <w:t>.</w:t>
       </w:r>
     </w:p>
     <w:p>
@@ -831,80 +1578,205 @@
         <w:t xml:space="preserve">Suarez (2021) proposes a simple </w:t>
       </w:r>
       <w:r>
-        <w:t>welfare</w:t>
+        <w:t xml:space="preserve">welfare </w:t>
+      </w:r>
+      <w:r>
+        <w:t xml:space="preserve">function derived from micro </w:t>
+      </w:r>
+      <w:r>
+        <w:t>foundations</w:t>
+      </w:r>
+      <w:r>
+        <w:t xml:space="preserve">. We use our </w:t>
+      </w:r>
+      <w:r>
+        <w:t>empirical</w:t>
+      </w:r>
+      <w:r>
+        <w:t xml:space="preserve"> framework alongside this </w:t>
+      </w:r>
+      <w:r>
+        <w:t>utility</w:t>
+      </w:r>
+      <w:r>
+        <w:t xml:space="preserve"> function to </w:t>
+      </w:r>
+      <w:r>
+        <w:t xml:space="preserve">determine </w:t>
+      </w:r>
+      <w:r>
+        <w:t>the “</w:t>
+      </w:r>
+      <w:r>
+        <w:t>optimal policy</w:t>
+      </w:r>
+      <w:r>
+        <w:t xml:space="preserve">.” Meanwhile, with the “frontier approach” we use </w:t>
+      </w:r>
+      <w:r>
+        <w:t>empirical</w:t>
+      </w:r>
+      <w:r>
+        <w:t xml:space="preserve"> data to </w:t>
+      </w:r>
+      <w:r>
+        <w:t>construct</w:t>
+      </w:r>
+      <w:r>
+        <w:t xml:space="preserve"> an alternative </w:t>
+      </w:r>
+      <w:r>
+        <w:t>utility</w:t>
+      </w:r>
+      <w:r>
+        <w:t xml:space="preserve"> function, which is then similarly used to arrive at policy </w:t>
+      </w:r>
+      <w:r>
+        <w:t>recommendations</w:t>
+      </w:r>
+      <w:r>
+        <w:t xml:space="preserve">. </w:t>
+      </w:r>
+      <w:r>
+        <w:t>We have performed</w:t>
+      </w:r>
+      <w:r>
+        <w:t xml:space="preserve"> this</w:t>
+      </w:r>
+      <w:r>
+        <w:t xml:space="preserve"> analysis with a strong intention to use it in the policymaking procedure while also contributing to the existing research.</w:t>
+      </w:r>
+    </w:p>
+    <w:p>
+      <w:pPr>
+        <w:ind w:firstLine="284"/>
+      </w:pPr>
+      <w:r>
+        <w:t xml:space="preserve">The </w:t>
+      </w:r>
+      <w:r>
+        <w:t xml:space="preserve">rest of the </w:t>
+      </w:r>
+      <w:r>
+        <w:t xml:space="preserve">paper has the following structure. We discuss </w:t>
+      </w:r>
+      <w:r>
+        <w:t xml:space="preserve">the use of </w:t>
+      </w:r>
+      <w:r>
+        <w:t>macroprudential policy</w:t>
       </w:r>
       <w:r>
         <w:t xml:space="preserve"> </w:t>
       </w:r>
       <w:r>
-        <w:t xml:space="preserve">function derived from micro </w:t>
-      </w:r>
-      <w:r>
-        <w:t>foundations</w:t>
-      </w:r>
-      <w:r>
-        <w:t xml:space="preserve">. </w:t>
+        <w:t xml:space="preserve">so far worldwide and in Armenia </w:t>
+      </w:r>
+      <w:r>
+        <w:t xml:space="preserve">in Section 2. Section </w:t>
+      </w:r>
+      <w:r>
+        <w:t>3</w:t>
+      </w:r>
+      <w:r>
+        <w:t xml:space="preserve"> </w:t>
+      </w:r>
+      <w:r>
+        <w:t xml:space="preserve">will </w:t>
+      </w:r>
+      <w:r>
+        <w:t xml:space="preserve">introduce </w:t>
+      </w:r>
+      <w:r>
+        <w:t xml:space="preserve">the </w:t>
+      </w:r>
+      <w:r>
+        <w:t>methodology</w:t>
+      </w:r>
+      <w:r>
+        <w:t xml:space="preserve"> </w:t>
+      </w:r>
+      <w:r>
+        <w:t xml:space="preserve">and </w:t>
+      </w:r>
+      <w:r>
+        <w:t>the dat</w:t>
+      </w:r>
+      <w:r>
+        <w:t>a</w:t>
+      </w:r>
+      <w:r>
+        <w:t xml:space="preserve">. We discuss and interpret </w:t>
+      </w:r>
+      <w:r>
+        <w:t xml:space="preserve">the quantile regression </w:t>
+      </w:r>
+      <w:r>
+        <w:t xml:space="preserve">results in Section </w:t>
+      </w:r>
+      <w:r>
+        <w:t>4</w:t>
+      </w:r>
+      <w:r>
+        <w:t xml:space="preserve">. Section </w:t>
+      </w:r>
+      <w:r>
+        <w:t xml:space="preserve">5 </w:t>
+      </w:r>
+      <w:r>
+        <w:t xml:space="preserve">will </w:t>
+      </w:r>
+      <w:r>
+        <w:t>elaborate</w:t>
+      </w:r>
+      <w:r>
+        <w:t xml:space="preserve"> </w:t>
+      </w:r>
+      <w:r>
+        <w:t>further</w:t>
+      </w:r>
+      <w:r>
+        <w:t xml:space="preserve"> on the optimal policy rule by </w:t>
+      </w:r>
+      <w:r>
+        <w:t>examin</w:t>
+      </w:r>
+      <w:r>
+        <w:t xml:space="preserve">ing a </w:t>
       </w:r>
       <w:r>
         <w:lastRenderedPageBreak/>
-        <w:t xml:space="preserve">We use our </w:t>
-      </w:r>
-      <w:r>
-        <w:t>empirical</w:t>
-      </w:r>
-      <w:r>
-        <w:t xml:space="preserve"> framework alongside this </w:t>
-      </w:r>
-      <w:r>
-        <w:t>utility</w:t>
-      </w:r>
-      <w:r>
-        <w:t xml:space="preserve"> function to </w:t>
-      </w:r>
-      <w:r>
-        <w:t xml:space="preserve">determine </w:t>
-      </w:r>
-      <w:r>
-        <w:t>the “</w:t>
-      </w:r>
-      <w:r>
-        <w:t>optimal policy</w:t>
-      </w:r>
-      <w:r>
-        <w:t xml:space="preserve">.” Meanwhile, with the “frontier approach” we use </w:t>
-      </w:r>
-      <w:r>
-        <w:t>empirical</w:t>
-      </w:r>
-      <w:r>
-        <w:t xml:space="preserve"> data to </w:t>
-      </w:r>
-      <w:r>
-        <w:t>construct</w:t>
-      </w:r>
-      <w:r>
-        <w:t xml:space="preserve"> an alternative </w:t>
-      </w:r>
-      <w:r>
-        <w:t>utility</w:t>
-      </w:r>
-      <w:r>
-        <w:t xml:space="preserve"> function, which is then similarly used to arrive at policy </w:t>
-      </w:r>
-      <w:r>
-        <w:t>recommendations</w:t>
-      </w:r>
-      <w:r>
-        <w:t xml:space="preserve">. </w:t>
-      </w:r>
-      <w:r>
-        <w:t>We have performed</w:t>
-      </w:r>
-      <w:r>
-        <w:t xml:space="preserve"> this</w:t>
-      </w:r>
-      <w:r>
-        <w:t xml:space="preserve"> analysis with a strong intention to use it in the policymaking procedure while also contributing to the existing research.</w:t>
+        <w:t xml:space="preserve">practical </w:t>
+      </w:r>
+      <w:r>
+        <w:t>decision-making</w:t>
+      </w:r>
+      <w:r>
+        <w:t xml:space="preserve"> case for 2024 Q1. </w:t>
+      </w:r>
+      <w:r>
+        <w:t xml:space="preserve">Section </w:t>
+      </w:r>
+      <w:r>
+        <w:t xml:space="preserve">6 </w:t>
+      </w:r>
+      <w:r>
+        <w:t>concludes the paper</w:t>
+      </w:r>
+      <w:r>
+        <w:t xml:space="preserve"> and considers the </w:t>
+      </w:r>
+      <w:r>
+        <w:t>implications</w:t>
+      </w:r>
+      <w:r>
+        <w:t xml:space="preserve"> of the tool for the </w:t>
+      </w:r>
+      <w:r>
+        <w:t>policymakers</w:t>
+      </w:r>
+      <w:r>
+        <w:t>.</w:t>
       </w:r>
     </w:p>
     <w:p>
@@ -963,10 +1835,7 @@
         <w:t xml:space="preserve">macroprudential policy </w:t>
       </w:r>
       <w:r>
-        <w:t xml:space="preserve">has different effects on the GDP growth </w:t>
-      </w:r>
-      <w:r>
-        <w:t xml:space="preserve">distribution </w:t>
+        <w:t xml:space="preserve">has different effects on the GDP growth distribution </w:t>
       </w:r>
       <w:r>
         <w:t>(</w:t>
@@ -975,13 +1844,7 @@
         <w:rPr>
           <w:noProof/>
         </w:rPr>
-        <w:t>Boar</w:t>
-      </w:r>
-      <w:r>
-        <w:rPr>
-          <w:noProof/>
-        </w:rPr>
-        <w:t xml:space="preserve"> et al., 2017)</w:t>
+        <w:t>Boar et al., 2017)</w:t>
       </w:r>
       <w:r>
         <w:rPr>
@@ -1023,13 +1886,7 @@
         <w:rPr>
           <w:noProof/>
         </w:rPr>
-        <w:t>quantile regression</w:t>
-      </w:r>
-      <w:r>
-        <w:rPr>
-          <w:noProof/>
-        </w:rPr>
-        <w:t xml:space="preserve"> </w:t>
+        <w:t xml:space="preserve">quantile regression </w:t>
       </w:r>
       <w:r>
         <w:rPr>
@@ -1124,19 +1981,7 @@
         <w:rPr>
           <w:noProof/>
         </w:rPr>
-        <w:t xml:space="preserve"> just the </w:t>
-      </w:r>
-      <w:r>
-        <w:rPr>
-          <w:noProof/>
-        </w:rPr>
-        <w:t>conditional</w:t>
-      </w:r>
-      <w:r>
-        <w:rPr>
-          <w:noProof/>
-        </w:rPr>
-        <w:t xml:space="preserve"> mean. </w:t>
+        <w:t xml:space="preserve"> just the conditional mean. </w:t>
       </w:r>
       <w:r>
         <w:rPr>
@@ -1148,13 +1993,7 @@
         <w:rPr>
           <w:noProof/>
         </w:rPr>
-        <w:t>GARCH-type</w:t>
-      </w:r>
-      <w:r>
-        <w:rPr>
-          <w:noProof/>
-        </w:rPr>
-        <w:t xml:space="preserve"> </w:t>
+        <w:t xml:space="preserve">GARCH-type </w:t>
       </w:r>
       <w:r>
         <w:rPr>
@@ -1210,28 +2049,13 @@
         <w:t xml:space="preserve"> in this task. In a panel framework, </w:t>
       </w:r>
       <w:r>
-        <w:t>quantile regression</w:t>
-      </w:r>
-      <w:r>
-        <w:t xml:space="preserve"> helps to account for </w:t>
-      </w:r>
-      <w:r>
-        <w:t>heterogeneous covariates</w:t>
-      </w:r>
-      <w:r>
-        <w:t xml:space="preserve">, while the </w:t>
+        <w:t xml:space="preserve">quantile regression helps to account for heterogeneous covariates, while the </w:t>
       </w:r>
       <w:r>
         <w:t>fixed effects</w:t>
       </w:r>
       <w:r>
-        <w:t xml:space="preserve"> consider the </w:t>
-      </w:r>
-      <w:r>
-        <w:t>unobserved heterogeneity</w:t>
-      </w:r>
-      <w:r>
-        <w:t xml:space="preserve"> which doesn’t change with respect to time </w:t>
+        <w:t xml:space="preserve"> consider the unobserved heterogeneity which doesn’t change with respect to time </w:t>
       </w:r>
       <w:sdt>
         <w:sdtPr>
@@ -1260,13 +2084,7 @@
         </w:sdtContent>
       </w:sdt>
       <w:r>
-        <w:t xml:space="preserve">. It is important to note that in this framework the fixed effects are subject to change depending on the quantile. For a general case, a panel </w:t>
-      </w:r>
-      <w:r>
-        <w:t>quantile regression</w:t>
-      </w:r>
-      <w:r>
-        <w:t xml:space="preserve"> takes the following form:</w:t>
+        <w:t>. It is important to note that in this framework the fixed effects are subject to change depending on the quantile. For a general case, a panel quantile regression takes the following form:</w:t>
       </w:r>
     </w:p>
     <w:p>
@@ -1319,34 +2137,7 @@
                     <w:rPr>
                       <w:rFonts w:ascii="Cambria Math" w:hAnsi="Cambria Math"/>
                     </w:rPr>
-                    <m:t>i</m:t>
-                  </m:r>
-                  <m:r>
-                    <m:rPr>
-                      <m:sty m:val="bi"/>
-                    </m:rPr>
-                    <w:rPr>
-                      <w:rFonts w:ascii="Cambria Math" w:hAnsi="Cambria Math"/>
-                    </w:rPr>
-                    <m:t>,</m:t>
-                  </m:r>
-                  <m:r>
-                    <m:rPr>
-                      <m:sty m:val="bi"/>
-                    </m:rPr>
-                    <w:rPr>
-                      <w:rFonts w:ascii="Cambria Math" w:hAnsi="Cambria Math"/>
-                    </w:rPr>
-                    <m:t>t</m:t>
-                  </m:r>
-                  <m:r>
-                    <m:rPr>
-                      <m:sty m:val="bi"/>
-                    </m:rPr>
-                    <w:rPr>
-                      <w:rFonts w:ascii="Cambria Math" w:hAnsi="Cambria Math"/>
-                    </w:rPr>
-                    <m:t>+h</m:t>
+                    <m:t>i,t+h</m:t>
                   </m:r>
                 </m:sub>
               </m:sSub>
@@ -1388,8 +2179,30 @@
                     <w:rPr>
                       <w:rFonts w:ascii="Cambria Math" w:hAnsi="Cambria Math"/>
                     </w:rPr>
-                    <m:t>i</m:t>
+                    <m:t>i,τ</m:t>
                   </m:r>
+                </m:sub>
+              </m:sSub>
+              <m:r>
+                <m:rPr>
+                  <m:sty m:val="bi"/>
+                </m:rPr>
+                <w:rPr>
+                  <w:rFonts w:ascii="Cambria Math" w:hAnsi="Cambria Math"/>
+                </w:rPr>
+                <m:t>+</m:t>
+              </m:r>
+              <m:sSub>
+                <m:sSubPr>
+                  <m:ctrlPr>
+                    <w:rPr>
+                      <w:rFonts w:ascii="Cambria Math" w:hAnsi="Cambria Math"/>
+                      <w:b/>
+                      <w:i/>
+                    </w:rPr>
+                  </m:ctrlPr>
+                </m:sSubPr>
+                <m:e>
                   <m:r>
                     <m:rPr>
                       <m:sty m:val="bi"/>
@@ -1397,8 +2210,43 @@
                     <w:rPr>
                       <w:rFonts w:ascii="Cambria Math" w:hAnsi="Cambria Math"/>
                     </w:rPr>
-                    <m:t>,</m:t>
+                    <m:t>X</m:t>
                   </m:r>
+                </m:e>
+                <m:sub>
+                  <m:r>
+                    <m:rPr>
+                      <m:sty m:val="bi"/>
+                    </m:rPr>
+                    <w:rPr>
+                      <w:rFonts w:ascii="Cambria Math" w:hAnsi="Cambria Math"/>
+                    </w:rPr>
+                    <m:t>i,t</m:t>
+                  </m:r>
+                </m:sub>
+              </m:sSub>
+              <m:sSub>
+                <m:sSubPr>
+                  <m:ctrlPr>
+                    <w:rPr>
+                      <w:rFonts w:ascii="Cambria Math" w:hAnsi="Cambria Math"/>
+                      <w:b/>
+                      <w:i/>
+                    </w:rPr>
+                  </m:ctrlPr>
+                </m:sSubPr>
+                <m:e>
+                  <m:r>
+                    <m:rPr>
+                      <m:sty m:val="bi"/>
+                    </m:rPr>
+                    <w:rPr>
+                      <w:rFonts w:ascii="Cambria Math" w:hAnsi="Cambria Math"/>
+                    </w:rPr>
+                    <m:t>β</m:t>
+                  </m:r>
+                </m:e>
+                <m:sub>
                   <m:r>
                     <m:rPr>
                       <m:sty m:val="bi"/>
@@ -1437,99 +2285,6 @@
                     <w:rPr>
                       <w:rFonts w:ascii="Cambria Math" w:hAnsi="Cambria Math"/>
                     </w:rPr>
-                    <m:t>X</m:t>
-                  </m:r>
-                </m:e>
-                <m:sub>
-                  <m:r>
-                    <m:rPr>
-                      <m:sty m:val="bi"/>
-                    </m:rPr>
-                    <w:rPr>
-                      <w:rFonts w:ascii="Cambria Math" w:hAnsi="Cambria Math"/>
-                    </w:rPr>
-                    <m:t>i</m:t>
-                  </m:r>
-                  <m:r>
-                    <m:rPr>
-                      <m:sty m:val="bi"/>
-                    </m:rPr>
-                    <w:rPr>
-                      <w:rFonts w:ascii="Cambria Math" w:hAnsi="Cambria Math"/>
-                    </w:rPr>
-                    <m:t>,</m:t>
-                  </m:r>
-                  <m:r>
-                    <m:rPr>
-                      <m:sty m:val="bi"/>
-                    </m:rPr>
-                    <w:rPr>
-                      <w:rFonts w:ascii="Cambria Math" w:hAnsi="Cambria Math"/>
-                    </w:rPr>
-                    <m:t>t</m:t>
-                  </m:r>
-                </m:sub>
-              </m:sSub>
-              <m:sSub>
-                <m:sSubPr>
-                  <m:ctrlPr>
-                    <w:rPr>
-                      <w:rFonts w:ascii="Cambria Math" w:hAnsi="Cambria Math"/>
-                      <w:b/>
-                      <w:i/>
-                    </w:rPr>
-                  </m:ctrlPr>
-                </m:sSubPr>
-                <m:e>
-                  <m:r>
-                    <m:rPr>
-                      <m:sty m:val="bi"/>
-                    </m:rPr>
-                    <w:rPr>
-                      <w:rFonts w:ascii="Cambria Math" w:hAnsi="Cambria Math"/>
-                    </w:rPr>
-                    <m:t>β</m:t>
-                  </m:r>
-                </m:e>
-                <m:sub>
-                  <m:r>
-                    <m:rPr>
-                      <m:sty m:val="bi"/>
-                    </m:rPr>
-                    <w:rPr>
-                      <w:rFonts w:ascii="Cambria Math" w:hAnsi="Cambria Math"/>
-                    </w:rPr>
-                    <m:t>τ</m:t>
-                  </m:r>
-                </m:sub>
-              </m:sSub>
-              <m:r>
-                <m:rPr>
-                  <m:sty m:val="bi"/>
-                </m:rPr>
-                <w:rPr>
-                  <w:rFonts w:ascii="Cambria Math" w:hAnsi="Cambria Math"/>
-                </w:rPr>
-                <m:t>+</m:t>
-              </m:r>
-              <m:sSub>
-                <m:sSubPr>
-                  <m:ctrlPr>
-                    <w:rPr>
-                      <w:rFonts w:ascii="Cambria Math" w:hAnsi="Cambria Math"/>
-                      <w:b/>
-                      <w:i/>
-                    </w:rPr>
-                  </m:ctrlPr>
-                </m:sSubPr>
-                <m:e>
-                  <m:r>
-                    <m:rPr>
-                      <m:sty m:val="bi"/>
-                    </m:rPr>
-                    <w:rPr>
-                      <w:rFonts w:ascii="Cambria Math" w:hAnsi="Cambria Math"/>
-                    </w:rPr>
                     <m:t>v</m:t>
                   </m:r>
                 </m:e>
@@ -1541,16 +2296,7 @@
                     <w:rPr>
                       <w:rFonts w:ascii="Cambria Math" w:hAnsi="Cambria Math"/>
                     </w:rPr>
-                    <m:t>τ</m:t>
-                  </m:r>
-                  <m:r>
-                    <m:rPr>
-                      <m:sty m:val="bi"/>
-                    </m:rPr>
-                    <w:rPr>
-                      <w:rFonts w:ascii="Cambria Math" w:hAnsi="Cambria Math"/>
-                    </w:rPr>
-                    <m:t>,t+h</m:t>
+                    <m:t>τ,t+h</m:t>
                   </m:r>
                 </m:sub>
               </m:sSub>
@@ -1640,16 +2386,7 @@
                     <w:rPr>
                       <w:rFonts w:ascii="Cambria Math" w:hAnsi="Cambria Math"/>
                     </w:rPr>
-                    <m:t>τ</m:t>
-                  </m:r>
-                  <m:r>
-                    <m:rPr>
-                      <m:sty m:val="bi"/>
-                    </m:rPr>
-                    <w:rPr>
-                      <w:rFonts w:ascii="Cambria Math" w:hAnsi="Cambria Math"/>
-                    </w:rPr>
-                    <m:t>,t+h</m:t>
+                    <m:t>τ,t+h</m:t>
                   </m:r>
                 </m:sub>
               </m:sSub>
@@ -1717,16 +2454,7 @@
                         <w:rPr>
                           <w:rFonts w:ascii="Cambria Math" w:hAnsi="Cambria Math"/>
                         </w:rPr>
-                        <m:t>t</m:t>
-                      </m:r>
-                      <m:r>
-                        <m:rPr>
-                          <m:sty m:val="bi"/>
-                        </m:rPr>
-                        <w:rPr>
-                          <w:rFonts w:ascii="Cambria Math" w:hAnsi="Cambria Math"/>
-                        </w:rPr>
-                        <m:t>=1</m:t>
+                        <m:t>t=1</m:t>
                       </m:r>
                     </m:sub>
                     <m:sup>
@@ -1827,34 +2555,7 @@
                                     <w:rPr>
                                       <w:rFonts w:ascii="Cambria Math" w:hAnsi="Cambria Math"/>
                                     </w:rPr>
-                                    <m:t>i</m:t>
-                                  </m:r>
-                                  <m:r>
-                                    <m:rPr>
-                                      <m:sty m:val="bi"/>
-                                    </m:rPr>
-                                    <w:rPr>
-                                      <w:rFonts w:ascii="Cambria Math" w:hAnsi="Cambria Math"/>
-                                    </w:rPr>
-                                    <m:t>,</m:t>
-                                  </m:r>
-                                  <m:r>
-                                    <m:rPr>
-                                      <m:sty m:val="bi"/>
-                                    </m:rPr>
-                                    <w:rPr>
-                                      <w:rFonts w:ascii="Cambria Math" w:hAnsi="Cambria Math"/>
-                                    </w:rPr>
-                                    <m:t>t</m:t>
-                                  </m:r>
-                                  <m:r>
-                                    <m:rPr>
-                                      <m:sty m:val="bi"/>
-                                    </m:rPr>
-                                    <w:rPr>
-                                      <w:rFonts w:ascii="Cambria Math" w:hAnsi="Cambria Math"/>
-                                    </w:rPr>
-                                    <m:t>+h</m:t>
+                                    <m:t>i,t+h</m:t>
                                   </m:r>
                                 </m:sub>
                               </m:sSub>
@@ -1865,16 +2566,7 @@
                                 <w:rPr>
                                   <w:rFonts w:ascii="Cambria Math" w:hAnsi="Cambria Math"/>
                                 </w:rPr>
-                                <m:t>-</m:t>
-                              </m:r>
-                              <m:r>
-                                <m:rPr>
-                                  <m:sty m:val="bi"/>
-                                </m:rPr>
-                                <w:rPr>
-                                  <w:rFonts w:ascii="Cambria Math" w:hAnsi="Cambria Math"/>
-                                </w:rPr>
-                                <m:t>y</m:t>
+                                <m:t>-y</m:t>
                               </m:r>
                             </m:e>
                             <m:sub>
@@ -1885,34 +2577,7 @@
                                 <w:rPr>
                                   <w:rFonts w:ascii="Cambria Math" w:hAnsi="Cambria Math"/>
                                 </w:rPr>
-                                <m:t>i</m:t>
-                              </m:r>
-                              <m:r>
-                                <m:rPr>
-                                  <m:sty m:val="bi"/>
-                                </m:rPr>
-                                <w:rPr>
-                                  <w:rFonts w:ascii="Cambria Math" w:hAnsi="Cambria Math"/>
-                                </w:rPr>
-                                <m:t>,</m:t>
-                              </m:r>
-                              <m:r>
-                                <m:rPr>
-                                  <m:sty m:val="bi"/>
-                                </m:rPr>
-                                <w:rPr>
-                                  <w:rFonts w:ascii="Cambria Math" w:hAnsi="Cambria Math"/>
-                                </w:rPr>
-                                <m:t>t</m:t>
-                              </m:r>
-                              <m:r>
-                                <m:rPr>
-                                  <m:sty m:val="bi"/>
-                                </m:rPr>
-                                <w:rPr>
-                                  <w:rFonts w:ascii="Cambria Math" w:hAnsi="Cambria Math"/>
-                                </w:rPr>
-                                <m:t>+h</m:t>
+                                <m:t>i,t+h</m:t>
                               </m:r>
                             </m:sub>
                             <m:sup>
@@ -2083,34 +2748,7 @@
                         <w:rPr>
                           <w:rFonts w:ascii="Cambria Math" w:hAnsi="Cambria Math"/>
                         </w:rPr>
-                        <m:t>i</m:t>
-                      </m:r>
-                      <m:r>
-                        <m:rPr>
-                          <m:sty m:val="bi"/>
-                        </m:rPr>
-                        <w:rPr>
-                          <w:rFonts w:ascii="Cambria Math" w:hAnsi="Cambria Math"/>
-                        </w:rPr>
-                        <m:t>,</m:t>
-                      </m:r>
-                      <m:r>
-                        <m:rPr>
-                          <m:sty m:val="bi"/>
-                        </m:rPr>
-                        <w:rPr>
-                          <w:rFonts w:ascii="Cambria Math" w:hAnsi="Cambria Math"/>
-                        </w:rPr>
-                        <m:t>t</m:t>
-                      </m:r>
-                      <m:r>
-                        <m:rPr>
-                          <m:sty m:val="bi"/>
-                        </m:rPr>
-                        <w:rPr>
-                          <w:rFonts w:ascii="Cambria Math" w:hAnsi="Cambria Math"/>
-                        </w:rPr>
-                        <m:t>+h</m:t>
+                        <m:t>i,t+h</m:t>
                       </m:r>
                     </m:sub>
                   </m:sSub>
@@ -2152,34 +2790,7 @@
                         <w:rPr>
                           <w:rFonts w:ascii="Cambria Math" w:hAnsi="Cambria Math"/>
                         </w:rPr>
-                        <m:t>i</m:t>
-                      </m:r>
-                      <m:r>
-                        <m:rPr>
-                          <m:sty m:val="bi"/>
-                        </m:rPr>
-                        <w:rPr>
-                          <w:rFonts w:ascii="Cambria Math" w:hAnsi="Cambria Math"/>
-                        </w:rPr>
-                        <m:t>,</m:t>
-                      </m:r>
-                      <m:r>
-                        <m:rPr>
-                          <m:sty m:val="bi"/>
-                        </m:rPr>
-                        <w:rPr>
-                          <w:rFonts w:ascii="Cambria Math" w:hAnsi="Cambria Math"/>
-                        </w:rPr>
-                        <m:t>t</m:t>
-                      </m:r>
-                      <m:r>
-                        <m:rPr>
-                          <m:sty m:val="bi"/>
-                        </m:rPr>
-                        <w:rPr>
-                          <w:rFonts w:ascii="Cambria Math" w:hAnsi="Cambria Math"/>
-                        </w:rPr>
-                        <m:t>+h</m:t>
+                        <m:t>i,t+h</m:t>
                       </m:r>
                     </m:sub>
                     <m:sup>
@@ -2223,16 +2834,7 @@
                     <w:rPr>
                       <w:rFonts w:ascii="Cambria Math" w:hAnsi="Cambria Math"/>
                     </w:rPr>
-                    <m:t>1-</m:t>
-                  </m:r>
-                  <m:r>
-                    <m:rPr>
-                      <m:sty m:val="bi"/>
-                    </m:rPr>
-                    <w:rPr>
-                      <w:rFonts w:ascii="Cambria Math" w:hAnsi="Cambria Math"/>
-                    </w:rPr>
-                    <m:t>τ</m:t>
+                    <m:t>1-τ</m:t>
                   </m:r>
                 </m:e>
               </m:d>
@@ -2296,34 +2898,7 @@
                         <w:rPr>
                           <w:rFonts w:ascii="Cambria Math" w:hAnsi="Cambria Math"/>
                         </w:rPr>
-                        <m:t>i</m:t>
-                      </m:r>
-                      <m:r>
-                        <m:rPr>
-                          <m:sty m:val="bi"/>
-                        </m:rPr>
-                        <w:rPr>
-                          <w:rFonts w:ascii="Cambria Math" w:hAnsi="Cambria Math"/>
-                        </w:rPr>
-                        <m:t>,</m:t>
-                      </m:r>
-                      <m:r>
-                        <m:rPr>
-                          <m:sty m:val="bi"/>
-                        </m:rPr>
-                        <w:rPr>
-                          <w:rFonts w:ascii="Cambria Math" w:hAnsi="Cambria Math"/>
-                        </w:rPr>
-                        <m:t>t</m:t>
-                      </m:r>
-                      <m:r>
-                        <m:rPr>
-                          <m:sty m:val="bi"/>
-                        </m:rPr>
-                        <w:rPr>
-                          <w:rFonts w:ascii="Cambria Math" w:hAnsi="Cambria Math"/>
-                        </w:rPr>
-                        <m:t>+h</m:t>
+                        <m:t>i,t+h</m:t>
                       </m:r>
                     </m:sub>
                   </m:sSub>
@@ -2365,34 +2940,7 @@
                         <w:rPr>
                           <w:rFonts w:ascii="Cambria Math" w:hAnsi="Cambria Math"/>
                         </w:rPr>
-                        <m:t>i</m:t>
-                      </m:r>
-                      <m:r>
-                        <m:rPr>
-                          <m:sty m:val="bi"/>
-                        </m:rPr>
-                        <w:rPr>
-                          <w:rFonts w:ascii="Cambria Math" w:hAnsi="Cambria Math"/>
-                        </w:rPr>
-                        <m:t>,</m:t>
-                      </m:r>
-                      <m:r>
-                        <m:rPr>
-                          <m:sty m:val="bi"/>
-                        </m:rPr>
-                        <w:rPr>
-                          <w:rFonts w:ascii="Cambria Math" w:hAnsi="Cambria Math"/>
-                        </w:rPr>
-                        <m:t>t</m:t>
-                      </m:r>
-                      <m:r>
-                        <m:rPr>
-                          <m:sty m:val="bi"/>
-                        </m:rPr>
-                        <w:rPr>
-                          <w:rFonts w:ascii="Cambria Math" w:hAnsi="Cambria Math"/>
-                        </w:rPr>
-                        <m:t>+h</m:t>
+                        <m:t>i,t+h</m:t>
                       </m:r>
                     </m:sub>
                     <m:sup>
@@ -2472,13 +3020,7 @@
               <w:rPr>
                 <w:rFonts w:ascii="Cambria Math" w:hAnsi="Cambria Math"/>
               </w:rPr>
-              <m:t>it</m:t>
-            </m:r>
-            <m:r>
-              <w:rPr>
-                <w:rFonts w:ascii="Cambria Math" w:hAnsi="Cambria Math"/>
-              </w:rPr>
-              <m:t>+h</m:t>
+              <m:t>it+h</m:t>
             </m:r>
           </m:sub>
           <m:sup>
@@ -2522,25 +3064,7 @@
               <w:rPr>
                 <w:rFonts w:ascii="Cambria Math" w:hAnsi="Cambria Math"/>
               </w:rPr>
-              <m:t>i</m:t>
-            </m:r>
-            <m:r>
-              <m:rPr>
-                <m:sty m:val="bi"/>
-              </m:rPr>
-              <w:rPr>
-                <w:rFonts w:ascii="Cambria Math" w:hAnsi="Cambria Math"/>
-              </w:rPr>
-              <m:t>,</m:t>
-            </m:r>
-            <m:r>
-              <m:rPr>
-                <m:sty m:val="bi"/>
-              </m:rPr>
-              <w:rPr>
-                <w:rFonts w:ascii="Cambria Math" w:hAnsi="Cambria Math"/>
-              </w:rPr>
-              <m:t>t</m:t>
+              <m:t>i,t</m:t>
             </m:r>
           </m:sub>
         </m:sSub>
@@ -2585,25 +3109,7 @@
               <w:rPr>
                 <w:rFonts w:ascii="Cambria Math" w:hAnsi="Cambria Math"/>
               </w:rPr>
-              <m:t>i</m:t>
-            </m:r>
-            <m:r>
-              <m:rPr>
-                <m:sty m:val="bi"/>
-              </m:rPr>
-              <w:rPr>
-                <w:rFonts w:ascii="Cambria Math" w:hAnsi="Cambria Math"/>
-              </w:rPr>
-              <m:t>,</m:t>
-            </m:r>
-            <m:r>
-              <m:rPr>
-                <m:sty m:val="bi"/>
-              </m:rPr>
-              <w:rPr>
-                <w:rFonts w:ascii="Cambria Math" w:hAnsi="Cambria Math"/>
-              </w:rPr>
-              <m:t>τ</m:t>
+              <m:t>i,τ</m:t>
             </m:r>
           </m:sub>
         </m:sSub>
@@ -2708,28 +3214,10 @@
         </m:r>
       </m:oMath>
       <w:r>
-        <w:t xml:space="preserve"> are the</w:t>
-      </w:r>
-      <w:r>
-        <w:t xml:space="preserve"> time</w:t>
-      </w:r>
-      <w:r>
-        <w:t xml:space="preserve"> </w:t>
-      </w:r>
-      <w:r>
-        <w:t>dimension</w:t>
-      </w:r>
-      <w:r>
-        <w:t xml:space="preserve"> and </w:t>
-      </w:r>
-      <w:r>
-        <w:t>the cross-section</w:t>
-      </w:r>
-      <w:r>
-        <w:t xml:space="preserve"> dimension</w:t>
-      </w:r>
-      <w:r>
-        <w:t xml:space="preserve"> respectively</w:t>
+        <w:t xml:space="preserve"> are the time dimension and </w:t>
+      </w:r>
+      <w:r>
+        <w:t>the cross-section dimension respectively</w:t>
       </w:r>
       <w:r>
         <w:t xml:space="preserve">. </w:t>
@@ -2784,10 +3272,7 @@
         </m:r>
       </m:oMath>
       <w:r>
-        <w:t>.</w:t>
-      </w:r>
-      <w:r>
-        <w:t xml:space="preserve"> </w:t>
+        <w:t xml:space="preserve">. </w:t>
       </w:r>
       <w:r>
         <w:t>An important note is that the model use</w:t>
@@ -2833,13 +3318,7 @@
       </w:pPr>
       <w:r>
         <w:lastRenderedPageBreak/>
-        <w:t>F</w:t>
-      </w:r>
-      <w:r>
-        <w:t>inancial conditions</w:t>
-      </w:r>
-      <w:r>
-        <w:t xml:space="preserve"> index</w:t>
+        <w:t>Financial conditions index</w:t>
       </w:r>
     </w:p>
     <w:p>
@@ -2868,10 +3347,7 @@
         <w:t xml:space="preserve">). The p-lag </w:t>
       </w:r>
       <w:r>
-        <w:t>TVP-FAVAR</w:t>
-      </w:r>
-      <w:r>
-        <w:t xml:space="preserve"> </w:t>
+        <w:t xml:space="preserve">TVP-FAVAR </w:t>
       </w:r>
       <w:sdt>
         <w:sdtPr>
@@ -3600,16 +4076,7 @@
                               <w:rPr>
                                 <w:rFonts w:ascii="Cambria Math" w:hAnsi="Cambria Math"/>
                               </w:rPr>
-                              <m:t>t</m:t>
-                            </m:r>
-                            <m:r>
-                              <m:rPr>
-                                <m:sty m:val="p"/>
-                              </m:rPr>
-                              <w:rPr>
-                                <w:rFonts w:ascii="Cambria Math" w:hAnsi="Cambria Math"/>
-                              </w:rPr>
-                              <m:t>-1</m:t>
+                              <m:t>t-1</m:t>
                             </m:r>
                           </m:sub>
                         </m:sSub>
@@ -3681,25 +4148,7 @@
                     <w:rPr>
                       <w:rFonts w:ascii="Cambria Math" w:hAnsi="Cambria Math"/>
                     </w:rPr>
-                    <m:t>…</m:t>
-                  </m:r>
-                  <m:r>
-                    <m:rPr>
-                      <m:sty m:val="p"/>
-                    </m:rPr>
-                    <w:rPr>
-                      <w:rFonts w:ascii="Cambria Math" w:hAnsi="Cambria Math"/>
-                    </w:rPr>
-                    <m:t>+</m:t>
-                  </m:r>
-                  <m:r>
-                    <m:rPr>
-                      <m:sty m:val="p"/>
-                    </m:rPr>
-                    <w:rPr>
-                      <w:rFonts w:ascii="Cambria Math" w:hAnsi="Cambria Math"/>
-                    </w:rPr>
-                    <m:t>Β</m:t>
+                    <m:t>…+Β</m:t>
                   </m:r>
                 </m:e>
                 <m:sub>
@@ -3782,16 +4231,7 @@
                               <w:rPr>
                                 <w:rFonts w:ascii="Cambria Math" w:hAnsi="Cambria Math"/>
                               </w:rPr>
-                              <m:t>t-</m:t>
-                            </m:r>
-                            <m:r>
-                              <m:rPr>
-                                <m:sty m:val="p"/>
-                              </m:rPr>
-                              <w:rPr>
-                                <w:rFonts w:ascii="Cambria Math" w:hAnsi="Cambria Math"/>
-                              </w:rPr>
-                              <m:t>p</m:t>
+                              <m:t>t-p</m:t>
                             </m:r>
                           </m:sub>
                         </m:sSub>
@@ -4290,13 +4730,7 @@
         </m:r>
       </m:oMath>
       <w:r>
-        <w:t xml:space="preserve"> vector of</w:t>
-      </w:r>
-      <w:r>
-        <w:t xml:space="preserve"> financial variables</w:t>
-      </w:r>
-      <w:r>
-        <w:t xml:space="preserve">, with </w:t>
+        <w:t xml:space="preserve"> vector of financial variables, with </w:t>
       </w:r>
       <m:oMath>
         <m:sSub>
@@ -4523,10 +4957,7 @@
         <w:t xml:space="preserve"> is a vector of </w:t>
       </w:r>
       <w:r>
-        <w:t>regression coefficients</w:t>
-      </w:r>
-      <w:r>
-        <w:t xml:space="preserve">, while </w:t>
+        <w:t xml:space="preserve">regression coefficients, while </w:t>
       </w:r>
       <m:oMath>
         <m:sSubSup>
@@ -4567,19 +4998,13 @@
         <w:t xml:space="preserve"> is a vector of </w:t>
       </w:r>
       <w:r>
-        <w:t>factor loadings</w:t>
-      </w:r>
-      <w:r>
-        <w:t xml:space="preserve">. In the state </w:t>
+        <w:t xml:space="preserve">factor loadings. In the state </w:t>
       </w:r>
       <w:r>
         <w:t>equation</w:t>
       </w:r>
       <w:r>
-        <w:t xml:space="preserve"> we have </w:t>
-      </w:r>
-      <w:r>
-        <w:t xml:space="preserve">the latent factor </w:t>
+        <w:t xml:space="preserve"> we have the latent factor </w:t>
       </w:r>
       <m:oMath>
         <m:sSub>
@@ -4609,13 +5034,7 @@
         </m:sSub>
       </m:oMath>
       <w:r>
-        <w:t xml:space="preserve"> </w:t>
-      </w:r>
-      <w:r>
-        <w:t>interpret</w:t>
-      </w:r>
-      <w:r>
-        <w:t>ed as the FCI.</w:t>
+        <w:t xml:space="preserve"> interpreted as the FCI.</w:t>
       </w:r>
       <w:r>
         <w:t xml:space="preserve"> The </w:t>
@@ -4648,13 +5067,7 @@
         </m:sSub>
       </m:oMath>
       <w:r>
-        <w:t xml:space="preserve"> is a vector </w:t>
-      </w:r>
-      <w:r>
-        <w:t>intercepts</w:t>
-      </w:r>
-      <w:r>
-        <w:t xml:space="preserve">, while </w:t>
+        <w:t xml:space="preserve"> is a vector intercepts, while </w:t>
       </w:r>
       <m:oMath>
         <m:r>
@@ -4745,16 +5158,7 @@
               <w:rPr>
                 <w:rFonts w:ascii="Cambria Math" w:hAnsi="Cambria Math"/>
               </w:rPr>
-              <m:t>,</m:t>
-            </m:r>
-            <m:r>
-              <m:rPr>
-                <m:sty m:val="p"/>
-              </m:rPr>
-              <w:rPr>
-                <w:rFonts w:ascii="Cambria Math" w:hAnsi="Cambria Math"/>
-              </w:rPr>
-              <m:t>p</m:t>
+              <m:t>,p</m:t>
             </m:r>
           </m:sub>
         </m:sSub>
@@ -5177,13 +5581,7 @@
                   <w:rPr>
                     <w:rFonts w:ascii="Cambria Math" w:hAnsi="Cambria Math"/>
                   </w:rPr>
-                  <m:t>…</m:t>
-                </m:r>
-                <m:r>
-                  <w:rPr>
-                    <w:rFonts w:ascii="Cambria Math" w:hAnsi="Cambria Math"/>
-                  </w:rPr>
-                  <m:t>ec</m:t>
+                  <m:t>…ec</m:t>
                 </m:r>
                 <m:sSup>
                   <m:sSupPr>
@@ -5240,16 +5638,7 @@
                               <w:rPr>
                                 <w:rFonts w:ascii="Cambria Math" w:hAnsi="Cambria Math"/>
                               </w:rPr>
-                              <m:t>,</m:t>
-                            </m:r>
-                            <m:r>
-                              <m:rPr>
-                                <m:sty m:val="p"/>
-                              </m:rPr>
-                              <w:rPr>
-                                <w:rFonts w:ascii="Cambria Math" w:hAnsi="Cambria Math"/>
-                              </w:rPr>
-                              <m:t>p</m:t>
+                              <m:t>,p</m:t>
                             </m:r>
                           </m:sub>
                         </m:sSub>
@@ -5449,22 +5838,7 @@
         <w:t xml:space="preserve"> are </w:t>
       </w:r>
       <w:r>
-        <w:t xml:space="preserve">zero-mean </w:t>
-      </w:r>
-      <w:r>
-        <w:t>g</w:t>
-      </w:r>
-      <w:r>
-        <w:t>aussian disturbances</w:t>
-      </w:r>
-      <w:r>
-        <w:t xml:space="preserve">. Their </w:t>
-      </w:r>
-      <w:r>
-        <w:t>covariances</w:t>
-      </w:r>
-      <w:r>
-        <w:t xml:space="preserve"> </w:t>
+        <w:t xml:space="preserve">zero-mean gaussian disturbances. Their covariances </w:t>
       </w:r>
       <m:oMath>
         <m:sSub>
@@ -5694,16 +6068,7 @@
         <w:t xml:space="preserve"> </w:t>
       </w:r>
       <w:r>
-        <w:t xml:space="preserve">are </w:t>
-      </w:r>
-      <w:r>
-        <w:t>diagonal</w:t>
-      </w:r>
-      <w:r>
-        <w:t xml:space="preserve">, thus the </w:t>
-      </w:r>
-      <w:r>
-        <w:t>disturbance terms are uncorrelated with each other.</w:t>
+        <w:t>are diagonal, thus the disturbance terms are uncorrelated with each other.</w:t>
       </w:r>
     </w:p>
     <w:p>
@@ -5711,19 +6076,7 @@
         <w:ind w:firstLine="284"/>
       </w:pPr>
       <w:r>
-        <w:t>To estimate the model a 3-step algorithm is used. First, we i</w:t>
-      </w:r>
-      <w:r>
-        <w:t xml:space="preserve">nitialize </w:t>
-      </w:r>
-      <w:r>
-        <w:t>the</w:t>
-      </w:r>
-      <w:r>
-        <w:t xml:space="preserve"> parameter</w:t>
-      </w:r>
-      <w:r>
-        <w:t xml:space="preserve">s, and estimate the </w:t>
+        <w:t xml:space="preserve">To estimate the model a 3-step algorithm is used. First, we initialize the parameters, and estimate the </w:t>
       </w:r>
       <w:r>
         <w:t>principal component analysis</w:t>
@@ -5868,10 +6221,7 @@
         <w:t>”</w:t>
       </w:r>
       <w:r>
-        <w:t xml:space="preserve"> </w:t>
-      </w:r>
-      <w:r>
-        <w:t>(VD)</w:t>
+        <w:t xml:space="preserve"> (VD)</w:t>
       </w:r>
       <w:r>
         <w:t xml:space="preserve"> </w:t>
@@ -6164,10 +6514,7 @@
       </w:pPr>
       <w:r>
         <w:lastRenderedPageBreak/>
-        <w:t>Financial</w:t>
-      </w:r>
-      <w:r>
-        <w:t xml:space="preserve"> cycle index</w:t>
+        <w:t>Financial cycle index</w:t>
       </w:r>
     </w:p>
     <w:p>
@@ -6175,13 +6522,7 @@
         <w:ind w:firstLine="284"/>
       </w:pPr>
       <w:r>
-        <w:t>T</w:t>
-      </w:r>
-      <w:r>
-        <w:t>he financial cycle index is an aggregate of different variables related to loan loss. These include credit-to-GDP gap, private and corporate loan flows, real estate prices, and so on. Formally,</w:t>
-      </w:r>
-      <w:r>
-        <w:t xml:space="preserve"> </w:t>
+        <w:t xml:space="preserve">The financial cycle index is an aggregate of different variables related to loan loss. These include credit-to-GDP gap, private and corporate loan flows, real estate prices, and so on. Formally, </w:t>
       </w:r>
       <w:sdt>
         <w:sdtPr>
@@ -6210,19 +6551,7 @@
         </w:sdtContent>
       </w:sdt>
       <w:r>
-        <w:t xml:space="preserve"> the </w:t>
-      </w:r>
-      <w:r>
-        <w:t>aggregation</w:t>
-      </w:r>
-      <w:r>
-        <w:t xml:space="preserve"> can be </w:t>
-      </w:r>
-      <w:r>
-        <w:t>expressed</w:t>
-      </w:r>
-      <w:r>
-        <w:t xml:space="preserve"> as:</w:t>
+        <w:t xml:space="preserve"> the aggregation can be expressed as:</w:t>
       </w:r>
     </w:p>
     <w:p>
@@ -6502,13 +6831,7 @@
         <w:t>exogenous</w:t>
       </w:r>
       <w:r>
-        <w:t xml:space="preserve"> indicators at time t and w is a vector showing the </w:t>
-      </w:r>
-      <w:r>
-        <w:t xml:space="preserve">relative </w:t>
-      </w:r>
-      <w:r>
-        <w:t xml:space="preserve">importance of the values in </w:t>
+        <w:t xml:space="preserve"> indicators at time t and w is a vector showing the relative importance of the values in </w:t>
       </w:r>
       <m:oMath>
         <m:sSub>
@@ -6594,13 +6917,7 @@
         </m:d>
       </m:oMath>
       <w:r>
-        <w:t xml:space="preserve"> is the </w:t>
-      </w:r>
-      <w:r>
-        <w:t>Hadamard-product</w:t>
-      </w:r>
-      <w:r>
-        <w:t xml:space="preserve"> between the vectors (</w:t>
+        <w:t xml:space="preserve"> is the Hadamard-product between the vectors (</w:t>
       </w:r>
       <w:r>
         <w:t>element-wise multiplication</w:t>
@@ -6636,19 +6953,7 @@
         </m:sSub>
       </m:oMath>
       <w:r>
-        <w:t xml:space="preserve"> </w:t>
-      </w:r>
-      <w:r>
-        <w:t>contains values of the cross-correlation coefficients</w:t>
-      </w:r>
-      <w:r>
-        <w:t xml:space="preserve"> for the </w:t>
-      </w:r>
-      <w:r>
-        <w:t>indicators</w:t>
-      </w:r>
-      <w:r>
-        <w:t xml:space="preserve"> at time t. The matrix </w:t>
+        <w:t xml:space="preserve"> contains values of the cross-correlation coefficients for the indicators at time t. The matrix </w:t>
       </w:r>
       <m:oMath>
         <m:sSub>
@@ -6678,19 +6983,7 @@
         </m:sSub>
       </m:oMath>
       <w:r>
-        <w:t xml:space="preserve"> is </w:t>
-      </w:r>
-      <w:r>
-        <w:t xml:space="preserve">estimated recursively using </w:t>
-      </w:r>
-      <w:r>
-        <w:t xml:space="preserve">an </w:t>
-      </w:r>
-      <w:r>
-        <w:t>exponentially weighted moving average (EWMA)</w:t>
-      </w:r>
-      <w:r>
-        <w:t xml:space="preserve"> process</w:t>
+        <w:t xml:space="preserve"> is estimated recursively using an exponentially weighted moving average (EWMA) process</w:t>
       </w:r>
       <w:r>
         <w:t xml:space="preserve">, </w:t>
@@ -6699,25 +6992,7 @@
         <w:t>utilizing</w:t>
       </w:r>
       <w:r>
-        <w:t xml:space="preserve"> the previous </w:t>
-      </w:r>
-      <w:r>
-        <w:t>variance</w:t>
-      </w:r>
-      <w:r>
-        <w:t xml:space="preserve"> and </w:t>
-      </w:r>
-      <w:r>
-        <w:t>covariance</w:t>
-      </w:r>
-      <w:r>
-        <w:t xml:space="preserve"> values as a base. Finally, the </w:t>
-      </w:r>
-      <w:r>
-        <w:t>relative weight</w:t>
-      </w:r>
-      <w:r>
-        <w:t xml:space="preserve">s </w:t>
+        <w:t xml:space="preserve"> the previous variance and covariance values as a base. Finally, the relative weights </w:t>
       </w:r>
       <m:oMath>
         <m:r>
@@ -6728,13 +7003,7 @@
         </m:r>
       </m:oMath>
       <w:r>
-        <w:t xml:space="preserve"> are </w:t>
-      </w:r>
-      <w:r>
-        <w:t>determined</w:t>
-      </w:r>
-      <w:r>
-        <w:t xml:space="preserve"> by running a constrained optimization to find the </w:t>
+        <w:t xml:space="preserve"> are determined by running a constrained optimization to find the </w:t>
       </w:r>
       <m:oMath>
         <m:r>
@@ -6770,10 +7039,7 @@
         </m:sSub>
       </m:oMath>
       <w:r>
-        <w:t xml:space="preserve"> that provides the best predictions for </w:t>
-      </w:r>
-      <w:r>
-        <w:t>future loan loss impairments</w:t>
+        <w:t xml:space="preserve"> that provides the best predictions for future loan loss impairments</w:t>
       </w:r>
       <w:r>
         <w:t xml:space="preserve"> </w:t>
@@ -6820,10 +7086,7 @@
         <w:t>Q</w:t>
       </w:r>
       <w:r>
-        <w:t>uantile regression</w:t>
-      </w:r>
-      <w:r>
-        <w:t xml:space="preserve"> for Armenia</w:t>
+        <w:t>uantile regression for Armenia</w:t>
       </w:r>
     </w:p>
     <w:p>
@@ -6831,25 +7094,7 @@
         <w:ind w:firstLine="284"/>
       </w:pPr>
       <w:r>
-        <w:t xml:space="preserve">The </w:t>
-      </w:r>
-      <w:r>
-        <w:t xml:space="preserve">baseline </w:t>
-      </w:r>
-      <w:r>
-        <w:t>q</w:t>
-      </w:r>
-      <w:r>
-        <w:t>uantile regression</w:t>
-      </w:r>
-      <w:r>
-        <w:t xml:space="preserve"> </w:t>
-      </w:r>
-      <w:r>
-        <w:t>model</w:t>
-      </w:r>
-      <w:r>
-        <w:t xml:space="preserve"> for the Armenian economic takes the form:</w:t>
+        <w:t>The baseline quantile regression model for the Armenian economic takes the form:</w:t>
       </w:r>
     </w:p>
     <w:p>
@@ -7057,13 +7302,7 @@
                 <w:rPr>
                   <w:rFonts w:ascii="Cambria Math" w:hAnsi="Cambria Math"/>
                 </w:rPr>
-                <m:t>3</m:t>
-              </m:r>
-              <m:r>
-                <w:rPr>
-                  <w:rFonts w:ascii="Cambria Math" w:hAnsi="Cambria Math"/>
-                </w:rPr>
-                <m:t>,τ</m:t>
+                <m:t>3,τ</m:t>
               </m:r>
             </m:sub>
           </m:sSub>
@@ -7121,13 +7360,7 @@
                 <w:rPr>
                   <w:rFonts w:ascii="Cambria Math" w:hAnsi="Cambria Math"/>
                 </w:rPr>
-                <m:t>4</m:t>
-              </m:r>
-              <m:r>
-                <w:rPr>
-                  <w:rFonts w:ascii="Cambria Math" w:hAnsi="Cambria Math"/>
-                </w:rPr>
-                <m:t>,τ</m:t>
+                <m:t>4,τ</m:t>
               </m:r>
             </m:sub>
           </m:sSub>
@@ -7185,13 +7418,7 @@
                 <w:rPr>
                   <w:rFonts w:ascii="Cambria Math" w:hAnsi="Cambria Math"/>
                 </w:rPr>
-                <m:t>5</m:t>
-              </m:r>
-              <m:r>
-                <w:rPr>
-                  <w:rFonts w:ascii="Cambria Math" w:hAnsi="Cambria Math"/>
-                </w:rPr>
-                <m:t>,τ</m:t>
+                <m:t>5,τ</m:t>
               </m:r>
             </m:sub>
           </m:sSub>
@@ -7249,13 +7476,7 @@
                 <w:rPr>
                   <w:rFonts w:ascii="Cambria Math" w:hAnsi="Cambria Math"/>
                 </w:rPr>
-                <m:t>6</m:t>
-              </m:r>
-              <m:r>
-                <w:rPr>
-                  <w:rFonts w:ascii="Cambria Math" w:hAnsi="Cambria Math"/>
-                </w:rPr>
-                <m:t>,τ</m:t>
+                <m:t>6,τ</m:t>
               </m:r>
             </m:sub>
           </m:sSub>
@@ -7313,13 +7534,7 @@
                 <w:rPr>
                   <w:rFonts w:ascii="Cambria Math" w:hAnsi="Cambria Math"/>
                 </w:rPr>
-                <m:t>7</m:t>
-              </m:r>
-              <m:r>
-                <w:rPr>
-                  <w:rFonts w:ascii="Cambria Math" w:hAnsi="Cambria Math"/>
-                </w:rPr>
-                <m:t>,τ</m:t>
+                <m:t>7,τ</m:t>
               </m:r>
             </m:sub>
           </m:sSub>
@@ -7356,6 +7571,9 @@
             <m:t>+</m:t>
           </m:r>
           <m:r>
+            <m:rPr>
+              <m:sty m:val="p"/>
+            </m:rPr>
             <w:rPr>
               <w:rFonts w:ascii="Cambria Math" w:hAnsi="Cambria Math"/>
             </w:rPr>
@@ -7402,13 +7620,7 @@
                     <w:rPr>
                       <w:rFonts w:ascii="Cambria Math" w:hAnsi="Cambria Math"/>
                     </w:rPr>
-                    <m:t>8</m:t>
-                  </m:r>
-                  <m:r>
-                    <w:rPr>
-                      <w:rFonts w:ascii="Cambria Math" w:hAnsi="Cambria Math"/>
-                    </w:rPr>
-                    <m:t>,τ</m:t>
+                    <m:t>8,τ</m:t>
                   </m:r>
                 </m:sub>
               </m:sSub>
@@ -7466,13 +7678,7 @@
                     <w:rPr>
                       <w:rFonts w:ascii="Cambria Math" w:hAnsi="Cambria Math"/>
                     </w:rPr>
-                    <m:t>9</m:t>
-                  </m:r>
-                  <m:r>
-                    <w:rPr>
-                      <w:rFonts w:ascii="Cambria Math" w:hAnsi="Cambria Math"/>
-                    </w:rPr>
-                    <m:t>,τ</m:t>
+                    <m:t>9,τ</m:t>
                   </m:r>
                 </m:sub>
               </m:sSub>
@@ -7530,13 +7736,7 @@
                     <w:rPr>
                       <w:rFonts w:ascii="Cambria Math" w:hAnsi="Cambria Math"/>
                     </w:rPr>
-                    <m:t>10</m:t>
-                  </m:r>
-                  <m:r>
-                    <w:rPr>
-                      <w:rFonts w:ascii="Cambria Math" w:hAnsi="Cambria Math"/>
-                    </w:rPr>
-                    <m:t>,τ</m:t>
+                    <m:t>10,τ</m:t>
                   </m:r>
                 </m:sub>
               </m:sSub>
@@ -7562,13 +7762,7 @@
                     <w:rPr>
                       <w:rFonts w:ascii="Cambria Math" w:hAnsi="Cambria Math"/>
                     </w:rPr>
-                    <m:t>t</m:t>
-                  </m:r>
-                  <m:r>
-                    <w:rPr>
-                      <w:rFonts w:ascii="Cambria Math" w:hAnsi="Cambria Math"/>
-                    </w:rPr>
-                    <m:t>-1</m:t>
+                    <m:t>t-1</m:t>
                   </m:r>
                 </m:sub>
               </m:sSub>
@@ -7600,13 +7794,7 @@
                     <w:rPr>
                       <w:rFonts w:ascii="Cambria Math" w:hAnsi="Cambria Math"/>
                     </w:rPr>
-                    <m:t>11</m:t>
-                  </m:r>
-                  <m:r>
-                    <w:rPr>
-                      <w:rFonts w:ascii="Cambria Math" w:hAnsi="Cambria Math"/>
-                    </w:rPr>
-                    <m:t>,τ</m:t>
+                    <m:t>11,τ</m:t>
                   </m:r>
                 </m:sub>
               </m:sSub>
@@ -7664,13 +7852,7 @@
                     <w:rPr>
                       <w:rFonts w:ascii="Cambria Math" w:hAnsi="Cambria Math"/>
                     </w:rPr>
-                    <m:t>12</m:t>
-                  </m:r>
-                  <m:r>
-                    <w:rPr>
-                      <w:rFonts w:ascii="Cambria Math" w:hAnsi="Cambria Math"/>
-                    </w:rPr>
-                    <m:t>,τ</m:t>
+                    <m:t>12,τ</m:t>
                   </m:r>
                 </m:sub>
               </m:sSub>
@@ -7728,13 +7910,7 @@
                     <w:rPr>
                       <w:rFonts w:ascii="Cambria Math" w:hAnsi="Cambria Math"/>
                     </w:rPr>
-                    <m:t>13</m:t>
-                  </m:r>
-                  <m:r>
-                    <w:rPr>
-                      <w:rFonts w:ascii="Cambria Math" w:hAnsi="Cambria Math"/>
-                    </w:rPr>
-                    <m:t>,τ</m:t>
+                    <m:t>13,τ</m:t>
                   </m:r>
                 </m:sub>
               </m:sSub>
@@ -7832,42 +8008,18 @@
         </m:sSub>
       </m:oMath>
       <w:r>
-        <w:t xml:space="preserve"> is the </w:t>
-      </w:r>
-      <w:r>
-        <w:t>annualized average growth rate of real GDP</w:t>
-      </w:r>
-      <w:r>
-        <w:t xml:space="preserve"> at </w:t>
+        <w:t xml:space="preserve"> is the annualized average growth rate of real GDP at </w:t>
       </w:r>
       <m:oMath>
         <m:r>
           <w:rPr>
             <w:rFonts w:ascii="Cambria Math" w:hAnsi="Cambria Math"/>
           </w:rPr>
-          <m:t>t</m:t>
-        </m:r>
-        <m:r>
-          <w:rPr>
-            <w:rFonts w:ascii="Cambria Math" w:hAnsi="Cambria Math"/>
-          </w:rPr>
-          <m:t>+</m:t>
-        </m:r>
-        <m:r>
-          <w:rPr>
-            <w:rFonts w:ascii="Cambria Math" w:hAnsi="Cambria Math"/>
-          </w:rPr>
-          <m:t>h</m:t>
+          <m:t>t+h</m:t>
         </m:r>
       </m:oMath>
       <w:r>
-        <w:t xml:space="preserve"> </w:t>
-      </w:r>
-      <w:r>
-        <w:t>quarters ahead</w:t>
-      </w:r>
-      <w:r>
-        <w:t xml:space="preserve">. The </w:t>
+        <w:t xml:space="preserve"> quarters ahead. The </w:t>
       </w:r>
       <m:oMath>
         <m:sSub>
@@ -8089,19 +8241,7 @@
           <w:rPr>
             <w:rFonts w:ascii="Cambria Math" w:hAnsi="Cambria Math"/>
           </w:rPr>
-          <m:t>*</m:t>
-        </m:r>
-        <m:r>
-          <w:rPr>
-            <w:rFonts w:ascii="Cambria Math" w:hAnsi="Cambria Math"/>
-          </w:rPr>
-          <m:t>St</m:t>
-        </m:r>
-        <m:r>
-          <w:rPr>
-            <w:rFonts w:ascii="Cambria Math" w:hAnsi="Cambria Math"/>
-          </w:rPr>
-          <m:t>(</m:t>
+          <m:t>*St(</m:t>
         </m:r>
         <m:sSub>
           <m:sSubPr>
@@ -8264,19 +8404,7 @@
         <w:t xml:space="preserve"> and </w:t>
       </w:r>
       <w:r>
-        <w:t>the</w:t>
-      </w:r>
-      <w:r>
-        <w:t xml:space="preserve"> </w:t>
-      </w:r>
-      <w:r>
-        <w:t>1</w:t>
-      </w:r>
-      <w:r>
-        <w:t>-year average change</w:t>
-      </w:r>
-      <w:r>
-        <w:t xml:space="preserve"> in </w:t>
+        <w:t xml:space="preserve">the 1-year average change in </w:t>
       </w:r>
       <w:r>
         <w:t>capital adequacy ratio</w:t>
@@ -8333,19 +8461,7 @@
         <w:t>.</w:t>
       </w:r>
       <w:r>
-        <w:t xml:space="preserve"> The dataset includes </w:t>
-      </w:r>
-      <w:r>
-        <w:t>17 categories</w:t>
-      </w:r>
-      <w:r>
-        <w:t xml:space="preserve"> of </w:t>
-      </w:r>
-      <w:r>
-        <w:t>macroprudential measures</w:t>
-      </w:r>
-      <w:r>
-        <w:t xml:space="preserve"> over time. Each t</w:t>
+        <w:t xml:space="preserve"> The dataset includes 17 categories of macroprudential measures over time. Each t</w:t>
       </w:r>
       <w:r>
         <w:t xml:space="preserve">ightening is </w:t>
@@ -8384,13 +8500,7 @@
         <w:t xml:space="preserve">0. </w:t>
       </w:r>
       <w:r>
-        <w:t xml:space="preserve">We define the sum of the 17 dummy </w:t>
-      </w:r>
-      <w:r>
-        <w:t>categories</w:t>
-      </w:r>
-      <w:r>
-        <w:t xml:space="preserve"> at time t as </w:t>
+        <w:t xml:space="preserve">We define the sum of the 17 dummy categories at time t as </w:t>
       </w:r>
       <m:oMath>
         <m:r>
@@ -8767,13 +8877,7 @@
               <w:rPr>
                 <w:rFonts w:ascii="Cambria Math" w:hAnsi="Cambria Math"/>
               </w:rPr>
-              <m:t>t</m:t>
-            </m:r>
-            <m:r>
-              <w:rPr>
-                <w:rFonts w:ascii="Cambria Math" w:hAnsi="Cambria Math"/>
-              </w:rPr>
-              <m:t>-1</m:t>
+              <m:t>t-1</m:t>
             </m:r>
           </m:sub>
         </m:sSub>
@@ -8920,10 +9024,7 @@
         <w:t>average</w:t>
       </w:r>
       <w:r>
-        <w:t xml:space="preserve"> growth of</w:t>
-      </w:r>
-      <w:r>
-        <w:t xml:space="preserve"> c</w:t>
+        <w:t xml:space="preserve"> growth of c</w:t>
       </w:r>
       <w:r>
         <w:t>onstruction loans</w:t>
@@ -9299,10 +9400,7 @@
         </w:numPr>
       </w:pPr>
       <w:r>
-        <w:t>Suarez</w:t>
-      </w:r>
-      <w:r>
-        <w:t xml:space="preserve"> </w:t>
+        <w:t xml:space="preserve">Suarez </w:t>
       </w:r>
       <w:r>
         <w:t>welfare function</w:t>
@@ -9313,13 +9411,7 @@
         <w:ind w:firstLine="284"/>
       </w:pPr>
       <w:r>
-        <w:t xml:space="preserve">The one of the main advantages of GaR is that it is </w:t>
-      </w:r>
-      <w:r>
-        <w:t>measured in the same units as GDP growth</w:t>
-      </w:r>
-      <w:r>
-        <w:t xml:space="preserve">. This makes the comparison between the two very straightforward. </w:t>
+        <w:t xml:space="preserve">The one of the main advantages of GaR is that it is measured in the same units as GDP growth. This makes the comparison between the two very straightforward. </w:t>
       </w:r>
       <w:r>
         <w:t xml:space="preserve">Yet compared to </w:t>
@@ -9328,25 +9420,7 @@
         <w:t>monetary policy</w:t>
       </w:r>
       <w:r>
-        <w:t xml:space="preserve">, the macroprudential </w:t>
-      </w:r>
-      <w:r>
-        <w:t>policy literature still lacks explicit</w:t>
-      </w:r>
-      <w:r>
-        <w:t xml:space="preserve"> </w:t>
-      </w:r>
-      <w:r>
-        <w:t>design</w:t>
-      </w:r>
-      <w:r>
-        <w:t xml:space="preserve"> rules. </w:t>
-      </w:r>
-      <w:r>
-        <w:t>Javier Suarez (2021)</w:t>
-      </w:r>
-      <w:r>
-        <w:t xml:space="preserve"> fills this gap by suggesting a </w:t>
+        <w:t xml:space="preserve">, the macroprudential policy literature still lacks explicit design rules. Javier Suarez (2021) fills this gap by suggesting a </w:t>
       </w:r>
       <w:r>
         <w:t>welfare</w:t>
@@ -9358,10 +9432,7 @@
         <w:t xml:space="preserve">rewards expected GDP growth and </w:t>
       </w:r>
       <w:r>
-        <w:t>penalizes</w:t>
-      </w:r>
-      <w:r>
-        <w:t xml:space="preserve"> </w:t>
+        <w:t xml:space="preserve">penalizes </w:t>
       </w:r>
       <w:r>
         <w:t>the gap between expected GDP growth and GaR.</w:t>
@@ -9409,13 +9480,7 @@
         </m:r>
       </m:oMath>
       <w:r>
-        <w:t xml:space="preserve"> the </w:t>
-      </w:r>
-      <w:r>
-        <w:t>GDP growth rate</w:t>
-      </w:r>
-      <w:r>
-        <w:t>:</w:t>
+        <w:t xml:space="preserve"> the GDP growth rate:</w:t>
       </w:r>
     </w:p>
     <w:p>
@@ -9528,16 +9593,7 @@
                     <w:rPr>
                       <w:rFonts w:ascii="Cambria Math" w:hAnsi="Cambria Math"/>
                     </w:rPr>
-                    <m:t>1</m:t>
-                  </m:r>
-                  <m:r>
-                    <m:rPr>
-                      <m:sty m:val="p"/>
-                    </m:rPr>
-                    <w:rPr>
-                      <w:rFonts w:ascii="Cambria Math" w:hAnsi="Cambria Math"/>
-                    </w:rPr>
-                    <m:t>2</m:t>
+                    <m:t>12</m:t>
                   </m:r>
                 </m:e>
               </m:d>
@@ -9548,19 +9604,7 @@
     </w:p>
     <w:p>
       <w:r>
-        <w:t xml:space="preserve">Now let us assume that there is a </w:t>
-      </w:r>
-      <w:r>
-        <w:t>representative agent</w:t>
-      </w:r>
-      <w:r>
-        <w:t xml:space="preserve"> </w:t>
-      </w:r>
-      <w:r>
-        <w:t>with a local coefficient of absolute risk aversion</w:t>
-      </w:r>
-      <w:r>
-        <w:t xml:space="preserve"> </w:t>
+        <w:t xml:space="preserve">Now let us assume that there is a representative agent with a local coefficient of absolute risk aversion </w:t>
       </w:r>
       <m:oMath>
         <m:r>
@@ -9675,22 +9719,13 @@
         <w:t>Then</w:t>
       </w:r>
       <w:r>
-        <w:t xml:space="preserve"> we can express the </w:t>
-      </w:r>
-      <w:r>
-        <w:t>utility function</w:t>
-      </w:r>
-      <w:r>
-        <w:t xml:space="preserve"> </w:t>
+        <w:t xml:space="preserve"> we can express the utility function </w:t>
       </w:r>
       <w:r>
         <w:t xml:space="preserve">as one exhibiting </w:t>
       </w:r>
       <w:r>
-        <w:t>constant absolute risk aversion</w:t>
-      </w:r>
-      <w:r>
-        <w:t xml:space="preserve"> (CARA)</w:t>
+        <w:t>constant absolute risk aversion (CARA)</w:t>
       </w:r>
       <w:r>
         <w:t xml:space="preserve"> with </w:t>
@@ -9911,16 +9946,7 @@
                     <w:rPr>
                       <w:rFonts w:ascii="Cambria Math" w:hAnsi="Cambria Math"/>
                     </w:rPr>
-                    <m:t>1</m:t>
-                  </m:r>
-                  <m:r>
-                    <m:rPr>
-                      <m:sty m:val="p"/>
-                    </m:rPr>
-                    <w:rPr>
-                      <w:rFonts w:ascii="Cambria Math" w:hAnsi="Cambria Math"/>
-                    </w:rPr>
-                    <m:t>3</m:t>
+                    <m:t>13</m:t>
                   </m:r>
                 </m:e>
               </m:d>
@@ -9937,19 +9963,7 @@
         <w:t>equation</w:t>
       </w:r>
       <w:r>
-        <w:t xml:space="preserve"> (eq.) 11 in </w:t>
-      </w:r>
-      <w:r>
-        <w:t>eq.</w:t>
-      </w:r>
-      <w:r>
-        <w:t xml:space="preserve">12, then perform a </w:t>
-      </w:r>
-      <w:r>
-        <w:t>monotonic transformation</w:t>
-      </w:r>
-      <w:r>
-        <w:t>, then we get:</w:t>
+        <w:t xml:space="preserve"> (eq.) 11 in eq.12, then perform a monotonic transformation, then we get:</w:t>
       </w:r>
     </w:p>
     <w:p>
@@ -10116,16 +10130,7 @@
                 <w:rPr>
                   <w:rFonts w:ascii="Cambria Math" w:hAnsi="Cambria Math"/>
                 </w:rPr>
-                <m:t>=</m:t>
-              </m:r>
-              <m:r>
-                <m:rPr>
-                  <m:sty m:val="p"/>
-                </m:rPr>
-                <w:rPr>
-                  <w:rFonts w:ascii="Cambria Math" w:hAnsi="Cambria Math"/>
-                </w:rPr>
-                <m:t>-</m:t>
+                <m:t>=-</m:t>
               </m:r>
               <m:func>
                 <m:funcPr>
@@ -10355,13 +10360,7 @@
         </m:sSub>
       </m:oMath>
       <w:r>
-        <w:t xml:space="preserve"> d</w:t>
-      </w:r>
-      <w:r>
-        <w:t>escribes the agent’s coefficient of relative risk aversion</w:t>
-      </w:r>
-      <w:r>
-        <w:t xml:space="preserve"> at </w:t>
+        <w:t xml:space="preserve"> describes the agent’s coefficient of relative risk aversion at </w:t>
       </w:r>
       <m:oMath>
         <m:sSub>
@@ -10394,13 +10393,7 @@
         </m:sSub>
       </m:oMath>
       <w:r>
-        <w:t xml:space="preserve">. If we assume </w:t>
-      </w:r>
-      <w:r>
-        <w:t>GDP growth is normally distributed</w:t>
-      </w:r>
-      <w:r>
-        <w:t xml:space="preserve">, so that </w:t>
+        <w:t xml:space="preserve">. If we assume GDP growth is normally distributed, so that </w:t>
       </w:r>
       <m:oMath>
         <m:r>
@@ -10514,13 +10507,7 @@
         </m:r>
       </m:oMath>
       <w:r>
-        <w:t xml:space="preserve">, then using the known moment functions we can write the agent’s expected </w:t>
-      </w:r>
-      <w:r>
-        <w:t>utility</w:t>
-      </w:r>
-      <w:r>
-        <w:t xml:space="preserve"> as:</w:t>
+        <w:t>, then using the known moment functions we can write the agent’s expected utility as:</w:t>
       </w:r>
     </w:p>
     <w:p>
@@ -10917,16 +10904,7 @@
                     <w:rPr>
                       <w:rFonts w:ascii="Cambria Math" w:hAnsi="Cambria Math"/>
                     </w:rPr>
-                    <m:t>1</m:t>
-                  </m:r>
-                  <m:r>
-                    <m:rPr>
-                      <m:sty m:val="p"/>
-                    </m:rPr>
-                    <w:rPr>
-                      <w:rFonts w:ascii="Cambria Math" w:hAnsi="Cambria Math"/>
-                    </w:rPr>
-                    <m:t>5</m:t>
+                    <m:t>15</m:t>
                   </m:r>
                 </m:e>
               </m:d>
@@ -11113,16 +11091,7 @@
                     <w:rPr>
                       <w:rFonts w:ascii="Cambria Math" w:hAnsi="Cambria Math"/>
                     </w:rPr>
-                    <m:t>1</m:t>
-                  </m:r>
-                  <m:r>
-                    <m:rPr>
-                      <m:sty m:val="p"/>
-                    </m:rPr>
-                    <w:rPr>
-                      <w:rFonts w:ascii="Cambria Math" w:hAnsi="Cambria Math"/>
-                    </w:rPr>
-                    <m:t>6</m:t>
+                    <m:t>16</m:t>
                   </m:r>
                 </m:e>
               </m:d>
@@ -11323,16 +11292,7 @@
                     <w:rPr>
                       <w:rFonts w:ascii="Cambria Math" w:hAnsi="Cambria Math"/>
                     </w:rPr>
-                    <m:t>1</m:t>
-                  </m:r>
-                  <m:r>
-                    <m:rPr>
-                      <m:sty m:val="p"/>
-                    </m:rPr>
-                    <w:rPr>
-                      <w:rFonts w:ascii="Cambria Math" w:hAnsi="Cambria Math"/>
-                    </w:rPr>
-                    <m:t>7</m:t>
+                    <m:t>17</m:t>
                   </m:r>
                 </m:e>
               </m:d>
@@ -11673,16 +11633,7 @@
                     <w:rPr>
                       <w:rFonts w:ascii="Cambria Math" w:hAnsi="Cambria Math"/>
                     </w:rPr>
-                    <m:t>1</m:t>
-                  </m:r>
-                  <m:r>
-                    <m:rPr>
-                      <m:sty m:val="p"/>
-                    </m:rPr>
-                    <w:rPr>
-                      <w:rFonts w:ascii="Cambria Math" w:hAnsi="Cambria Math"/>
-                    </w:rPr>
-                    <m:t>8</m:t>
+                    <m:t>18</m:t>
                   </m:r>
                 </m:e>
               </m:d>
@@ -11858,19 +11809,7 @@
         <w:t>for financial instability</w:t>
       </w:r>
       <w:r>
-        <w:t xml:space="preserve">, we derive the </w:t>
-      </w:r>
-      <w:r>
-        <w:t>social welfare function</w:t>
-      </w:r>
-      <w:r>
-        <w:t xml:space="preserve"> proposed by </w:t>
-      </w:r>
-      <w:r>
-        <w:t>Suarez</w:t>
-      </w:r>
-      <w:r>
-        <w:t>:</w:t>
+        <w:t>, we derive the social welfare function proposed by Suarez:</w:t>
       </w:r>
     </w:p>
     <w:p>
@@ -12183,10 +12122,7 @@
         <w:t xml:space="preserve">quarterly </w:t>
       </w:r>
       <w:r>
-        <w:t>dataset with 43 countries and 21 variables for the period 1993-2023</w:t>
-      </w:r>
-      <w:r>
-        <w:t xml:space="preserve">. Most of this data was download from two key </w:t>
+        <w:t xml:space="preserve">dataset with 43 countries and 21 variables for the period 1993-2023. Most of this data was download from two key </w:t>
       </w:r>
       <w:r>
         <w:t>International Monetary Fund (IMF)</w:t>
@@ -12299,19 +12235,10 @@
         <w:t>indices</w:t>
       </w:r>
       <w:r>
-        <w:t xml:space="preserve">) for the </w:t>
-      </w:r>
-      <w:r>
-        <w:t>period 2003-2024</w:t>
-      </w:r>
-      <w:r>
-        <w:t xml:space="preserve">. The FCI required 17 interest rate related variables, FCyI was constructed using 12 credit related variables, while the final model included 11 </w:t>
-      </w:r>
-      <w:r>
-        <w:t>exogenous</w:t>
-      </w:r>
-      <w:r>
-        <w:t xml:space="preserve"> </w:t>
+        <w:t xml:space="preserve">) for the period 2003-2024. The FCI required 17 interest rate related variables, FCyI was constructed using 12 credit related variables, while the final model included 11 </w:t>
+      </w:r>
+      <w:r>
+        <w:t xml:space="preserve">exogenous </w:t>
       </w:r>
       <w:r>
         <w:t xml:space="preserve">indicators (including the two </w:t>
@@ -12435,34 +12362,10 @@
         <w:fldChar w:fldCharType="end"/>
       </w:r>
       <w:r>
-        <w:t xml:space="preserve">, we plot </w:t>
-      </w:r>
-      <w:r>
-        <w:t>FCyI</w:t>
-      </w:r>
-      <w:r>
-        <w:t xml:space="preserve">, </w:t>
-      </w:r>
-      <w:r>
-        <w:t>FCI</w:t>
-      </w:r>
-      <w:r>
-        <w:t xml:space="preserve"> and real GDP growth. </w:t>
-      </w:r>
-      <w:r>
-        <w:t xml:space="preserve">The key takeaway from this plot is that </w:t>
-      </w:r>
-      <w:r>
-        <w:t>FCyI</w:t>
-      </w:r>
-      <w:r>
-        <w:t xml:space="preserve"> and </w:t>
-      </w:r>
-      <w:r>
-        <w:t>FCI</w:t>
-      </w:r>
-      <w:r>
-        <w:t xml:space="preserve"> react different</w:t>
+        <w:t xml:space="preserve">, we plot FCyI, FCI and real GDP growth. </w:t>
+      </w:r>
+      <w:r>
+        <w:t>The key takeaway from this plot is that FCyI and FCI react different</w:t>
       </w:r>
       <w:r>
         <w:t>ly</w:t>
@@ -12559,8 +12462,8 @@
         <w:spacing w:before="0" w:line="240" w:lineRule="auto"/>
         <w:jc w:val="both"/>
       </w:pPr>
-      <w:bookmarkStart w:id="0" w:name="_Ref169637322"/>
-      <w:bookmarkStart w:id="1" w:name="_Ref169637532"/>
+      <w:bookmarkStart w:id="0" w:name="_Ref169637532"/>
+      <w:bookmarkStart w:id="1" w:name="_Ref169637322"/>
       <w:r>
         <w:t xml:space="preserve">Figure </w:t>
       </w:r>
@@ -12582,35 +12485,32 @@
       <w:r>
         <w:fldChar w:fldCharType="end"/>
       </w:r>
+      <w:bookmarkEnd w:id="0"/>
+      <w:r>
+        <w:t>.</w:t>
+      </w:r>
+      <w:r>
+        <w:t xml:space="preserve"> the </w:t>
+      </w:r>
+      <w:r>
+        <w:t>financial cycle index</w:t>
+      </w:r>
+      <w:r>
+        <w:t xml:space="preserve">, </w:t>
+      </w:r>
+      <w:r>
+        <w:t>financial</w:t>
+      </w:r>
+      <w:r>
+        <w:t xml:space="preserve"> conditions index and real GDP growth. The FCyI and FCI are normalized to have zero mean and a </w:t>
+      </w:r>
+      <w:r>
+        <w:t>standard deviation</w:t>
+      </w:r>
+      <w:r>
+        <w:t xml:space="preserve"> of one.</w:t>
+      </w:r>
       <w:bookmarkEnd w:id="1"/>
-      <w:r>
-        <w:t>.</w:t>
-      </w:r>
-      <w:r>
-        <w:t xml:space="preserve"> the </w:t>
-      </w:r>
-      <w:r>
-        <w:t>financial</w:t>
-      </w:r>
-      <w:r>
-        <w:t xml:space="preserve"> cycle index</w:t>
-      </w:r>
-      <w:r>
-        <w:t xml:space="preserve">, </w:t>
-      </w:r>
-      <w:r>
-        <w:t>financial</w:t>
-      </w:r>
-      <w:r>
-        <w:t xml:space="preserve"> conditions index and real GDP growth. The FCyI and FCI are normalized to have zero mean and a </w:t>
-      </w:r>
-      <w:r>
-        <w:t>standard deviation</w:t>
-      </w:r>
-      <w:r>
-        <w:t xml:space="preserve"> of one.</w:t>
-      </w:r>
-      <w:bookmarkEnd w:id="0"/>
     </w:p>
     <w:p>
       <w:pPr>
@@ -12642,13 +12542,7 @@
         <w:fldChar w:fldCharType="end"/>
       </w:r>
       <w:r>
-        <w:t>, m</w:t>
-      </w:r>
-      <w:r>
-        <w:t>acroprudential</w:t>
-      </w:r>
-      <w:r>
-        <w:t xml:space="preserve"> policy in Armenia has implemented a lot of </w:t>
+        <w:t xml:space="preserve">, macroprudential policy in Armenia has implemented a lot of </w:t>
       </w:r>
       <w:r>
         <w:t>tightening</w:t>
@@ -12768,14 +12662,7 @@
           <w:b w:val="0"/>
           <w:bCs/>
         </w:rPr>
-        <w:t>macroprudential policy</w:t>
-      </w:r>
-      <w:r>
-        <w:rPr>
-          <w:b w:val="0"/>
-          <w:bCs/>
-        </w:rPr>
-        <w:t xml:space="preserve"> in Armenia</w:t>
+        <w:t>macroprudential policy in Armenia</w:t>
       </w:r>
     </w:p>
     <w:p>
@@ -12816,13 +12703,7 @@
         <w:t>loosening</w:t>
       </w:r>
       <w:r>
-        <w:t xml:space="preserve"> windows to identify on how they could have reshaped the </w:t>
-      </w:r>
-      <w:r>
-        <w:t>distribution</w:t>
-      </w:r>
-      <w:r>
-        <w:t xml:space="preserve">. During </w:t>
+        <w:t xml:space="preserve"> windows to identify on how they could have reshaped the distribution. During </w:t>
       </w:r>
       <w:r>
         <w:t>tightening</w:t>
@@ -13040,13 +12921,7 @@
     </w:p>
     <w:p>
       <w:r>
-        <w:t xml:space="preserve">To better understand the effects of </w:t>
-      </w:r>
-      <w:r>
-        <w:t>macroprudential policy</w:t>
-      </w:r>
-      <w:r>
-        <w:t>, we estimate the model described in eq. 9.</w:t>
+        <w:t>To better understand the effects of macroprudential policy, we estimate the model described in eq. 9.</w:t>
       </w:r>
       <w:r>
         <w:t xml:space="preserve"> In </w:t>
@@ -13273,13 +13148,7 @@
         <w:fldChar w:fldCharType="separate"/>
       </w:r>
       <w:r>
-        <w:t>Figur</w:t>
-      </w:r>
-      <w:r>
-        <w:t>e</w:t>
-      </w:r>
-      <w:r>
-        <w:t xml:space="preserve"> </w:t>
+        <w:t xml:space="preserve">Figure </w:t>
       </w:r>
       <w:r>
         <w:rPr>
@@ -13300,13 +13169,7 @@
         <w:t xml:space="preserve">the </w:t>
       </w:r>
       <w:r>
-        <w:t xml:space="preserve">chats we can observe the </w:t>
-      </w:r>
-      <w:r>
-        <w:t xml:space="preserve">heterogeneous effects of </w:t>
-      </w:r>
-      <w:r>
-        <w:t xml:space="preserve">MPI. In the short run MPI has positive effect on the tail, and negative effects on the median. The short-run effects of MPI are </w:t>
+        <w:t xml:space="preserve">chats we can observe the heterogeneous effects of MPI. In the short run MPI has positive effect on the tail, and negative effects on the median. The short-run effects of MPI are </w:t>
       </w:r>
       <w:r>
         <w:t>insignificant</w:t>
@@ -13335,19 +13198,7 @@
         <w:ind w:firstLine="284"/>
       </w:pPr>
       <w:r>
-        <w:t xml:space="preserve">We also observe the </w:t>
-      </w:r>
-      <w:r>
-        <w:t>heterogeneous</w:t>
-      </w:r>
-      <w:r>
-        <w:t xml:space="preserve"> effects in FCyI, that said, most of these effects are insignificant in the short run. The </w:t>
-      </w:r>
-      <w:r>
-        <w:t>FCyI</w:t>
-      </w:r>
-      <w:r>
-        <w:t xml:space="preserve"> displays negative effects on the GDP distribution the long run. This is in line with the theory of business and financial cycles </w:t>
+        <w:t xml:space="preserve">We also observe the heterogeneous effects in FCyI, that said, most of these effects are insignificant in the short run. The FCyI displays negative effects on the GDP distribution the long run. This is in line with the theory of business and financial cycles </w:t>
       </w:r>
       <w:r>
         <w:t>where</w:t>
@@ -13356,10 +13207,7 @@
         <w:t xml:space="preserve"> a maturity or a peak</w:t>
       </w:r>
       <w:r>
-        <w:t xml:space="preserve"> </w:t>
-      </w:r>
-      <w:r>
-        <w:t>phase</w:t>
+        <w:t xml:space="preserve"> phase</w:t>
       </w:r>
       <w:r>
         <w:t xml:space="preserve"> is followed by a </w:t>
@@ -13579,63 +13427,7 @@
           <w:b w:val="0"/>
           <w:bCs/>
         </w:rPr>
-        <w:t>Es</w:t>
-      </w:r>
-      <w:r>
-        <w:rPr>
-          <w:b w:val="0"/>
-          <w:bCs/>
-        </w:rPr>
-        <w:t>timated quantile regression coefficients</w:t>
-      </w:r>
-      <w:r>
-        <w:rPr>
-          <w:b w:val="0"/>
-          <w:bCs/>
-        </w:rPr>
-        <w:t xml:space="preserve"> for horizons 4, 8 and 12. T</w:t>
-      </w:r>
-      <w:r>
-        <w:rPr>
-          <w:b w:val="0"/>
-          <w:bCs/>
-        </w:rPr>
-        <w:t xml:space="preserve">he grey shaded areas represent the 95% confidence </w:t>
-      </w:r>
-      <w:r>
-        <w:rPr>
-          <w:b w:val="0"/>
-          <w:bCs/>
-        </w:rPr>
-        <w:t xml:space="preserve">intervals. The </w:t>
-      </w:r>
-      <w:r>
-        <w:rPr>
-          <w:b w:val="0"/>
-          <w:bCs/>
-        </w:rPr>
-        <w:t>dashed horizontal line represent</w:t>
-      </w:r>
-      <w:r>
-        <w:rPr>
-          <w:b w:val="0"/>
-          <w:bCs/>
-        </w:rPr>
-        <w:t xml:space="preserve">s the OLS </w:t>
-      </w:r>
-      <w:r>
-        <w:rPr>
-          <w:b w:val="0"/>
-          <w:bCs/>
-        </w:rPr>
-        <w:t>coefficient</w:t>
-      </w:r>
-      <w:r>
-        <w:rPr>
-          <w:b w:val="0"/>
-          <w:bCs/>
-        </w:rPr>
-        <w:t>.</w:t>
+        <w:t>Estimated quantile regression coefficients for horizons 4, 8 and 12. The grey shaded areas represent the 95% confidence intervals. The dashed horizontal line represents the OLS coefficient.</w:t>
       </w:r>
     </w:p>
     <w:p>
@@ -13644,19 +13436,7 @@
         <w:ind w:firstLine="284"/>
       </w:pPr>
       <w:r>
-        <w:t xml:space="preserve">The FCI is also </w:t>
-      </w:r>
-      <w:r>
-        <w:t>insignificant</w:t>
-      </w:r>
-      <w:r>
-        <w:t xml:space="preserve"> in the short-run and yet shows </w:t>
-      </w:r>
-      <w:r>
-        <w:t>heterogeneous</w:t>
-      </w:r>
-      <w:r>
-        <w:t xml:space="preserve"> effects in the long-run. As one might expect financial stress</w:t>
+        <w:t>The FCI is also insignificant in the short-run and yet shows heterogeneous effects in the long-run. As one might expect financial stress</w:t>
       </w:r>
       <w:r>
         <w:t xml:space="preserve"> has cyclical properties and thus low stress today indicates a negative effect on</w:t>
@@ -13668,13 +13448,7 @@
         <w:t xml:space="preserve"> in the future</w:t>
       </w:r>
       <w:r>
-        <w:t xml:space="preserve">. Interestingly enough, the long run FCI effects on the tail are </w:t>
-      </w:r>
-      <w:r>
-        <w:t>insignificant</w:t>
-      </w:r>
-      <w:r>
-        <w:t>. This</w:t>
+        <w:t>. Interestingly enough, the long run FCI effects on the tail are insignificant. This</w:t>
       </w:r>
       <w:r>
         <w:t xml:space="preserve"> could</w:t>
@@ -13686,10 +13460,7 @@
         <w:t xml:space="preserve">s don’t </w:t>
       </w:r>
       <w:r>
-        <w:t>necessarily</w:t>
-      </w:r>
-      <w:r>
-        <w:t xml:space="preserve"> </w:t>
+        <w:t xml:space="preserve">necessarily </w:t>
       </w:r>
       <w:r>
         <w:t xml:space="preserve">determine the </w:t>
@@ -14025,13 +13796,7 @@
         <w:t>optimal policy calibration</w:t>
       </w:r>
       <w:r>
-        <w:t xml:space="preserve">. Note: to achieve the distribution for the </w:t>
-      </w:r>
-      <w:r>
-        <w:t>optimal policy</w:t>
-      </w:r>
-      <w:r>
-        <w:t xml:space="preserve"> case, MPI should increase by 1 (equivalent 0.5 step in CCyB). </w:t>
+        <w:t xml:space="preserve">. Note: to achieve the distribution for the optimal policy case, MPI should increase by 1 (equivalent 0.5 step in CCyB). </w:t>
       </w:r>
       <w:r>
         <w:t>Suarez</w:t>
@@ -16042,6 +15807,7 @@
   <w:style w:type="character" w:default="1" w:styleId="DefaultParagraphFont">
     <w:name w:val="Default Paragraph Font"/>
     <w:uiPriority w:val="1"/>
+    <w:semiHidden/>
     <w:unhideWhenUsed/>
   </w:style>
   <w:style w:type="table" w:default="1" w:styleId="TableNormal">
@@ -17423,12 +17189,6 @@
 </file>
 
 <file path=customXml/item1.xml><?xml version="1.0" encoding="utf-8"?>
-<p:properties xmlns:p="http://schemas.microsoft.com/office/2006/metadata/properties" xmlns:xsi="http://www.w3.org/2001/XMLSchema-instance" xmlns:pc="http://schemas.microsoft.com/office/infopath/2007/PartnerControls">
-  <documentManagement/>
-</p:properties>
-</file>
-
-<file path=customXml/item2.xml><?xml version="1.0" encoding="utf-8"?>
 <ct:contentTypeSchema xmlns:ct="http://schemas.microsoft.com/office/2006/metadata/contentType" xmlns:ma="http://schemas.microsoft.com/office/2006/metadata/properties/metaAttributes" ct:_="" ma:_="" ma:contentTypeName="Document" ma:contentTypeID="0x010100CDFA67BB8893134191D9394909D4A940" ma:contentTypeVersion="12" ma:contentTypeDescription="Create a new document." ma:contentTypeScope="" ma:versionID="7c9b21a987813599722e3730cd6eaecb">
   <xsd:schema xmlns:xsd="http://www.w3.org/2001/XMLSchema" xmlns:xs="http://www.w3.org/2001/XMLSchema" xmlns:p="http://schemas.microsoft.com/office/2006/metadata/properties" xmlns:ns2="8f8875c8-43a9-487a-8483-c93934f2a15b" xmlns:ns3="0822d87c-9f4b-4af0-9aff-df69078804cc" targetNamespace="http://schemas.microsoft.com/office/2006/metadata/properties" ma:root="true" ma:fieldsID="b378793884891a40cc43184d8f2d233b" ns2:_="" ns3:_="">
     <xsd:import namespace="8f8875c8-43a9-487a-8483-c93934f2a15b"/>
@@ -17645,6 +17405,12 @@
 </ct:contentTypeSchema>
 </file>
 
+<file path=customXml/item2.xml><?xml version="1.0" encoding="utf-8"?>
+<p:properties xmlns:p="http://schemas.microsoft.com/office/2006/metadata/properties" xmlns:xsi="http://www.w3.org/2001/XMLSchema-instance" xmlns:pc="http://schemas.microsoft.com/office/infopath/2007/PartnerControls">
+  <documentManagement/>
+</p:properties>
+</file>
+
 <file path=customXml/item3.xml><?xml version="1.0" encoding="utf-8"?>
 <?mso-contentType ?>
 <FormTemplates xmlns="http://schemas.microsoft.com/sharepoint/v3/contenttype/forms">
@@ -17671,7 +17437,7 @@
         </b:NameList>
       </b:Author>
     </b:Author>
-    <b:RefOrder>8</b:RefOrder>
+    <b:RefOrder>9</b:RefOrder>
   </b:Source>
   <b:Source>
     <b:Tag>Mac21</b:Tag>
@@ -17691,7 +17457,7 @@
     <b:Publisher>Hertie School</b:Publisher>
     <b:City>Berlin</b:City>
     <b:Year>2021</b:Year>
-    <b:RefOrder>9</b:RefOrder>
+    <b:RefOrder>10</b:RefOrder>
   </b:Source>
   <b:Source>
     <b:Tag>Ste22</b:Tag>
@@ -17719,7 +17485,7 @@
     <b:Publisher>SUERF</b:Publisher>
     <b:Year>2022</b:Year>
     <b:Institution>Oesterreichische Nationalbank</b:Institution>
-    <b:RefOrder>10</b:RefOrder>
+    <b:RefOrder>11</b:RefOrder>
   </b:Source>
   <b:Source>
     <b:Tag>Sto20</b:Tag>
@@ -17741,7 +17507,7 @@
     <b:Publisher>Reserve Bank of Australia</b:Publisher>
     <b:Month>September</b:Month>
     <b:Day>17</b:Day>
-    <b:RefOrder>11</b:RefOrder>
+    <b:RefOrder>12</b:RefOrder>
   </b:Source>
   <b:Source>
     <b:Tag>Galan</b:Tag>
@@ -17763,7 +17529,7 @@
     </b:Author>
     <b:Month>November</b:Month>
     <b:Issue>100831</b:Issue>
-    <b:RefOrder>2</b:RefOrder>
+    <b:RefOrder>5</b:RefOrder>
   </b:Source>
   <b:Source>
     <b:Tag>Gal14</b:Tag>
@@ -17788,7 +17554,7 @@
     </b:Author>
     <b:Publisher>Centre for Monetary and Financial Studies (CEMFI)</b:Publisher>
     <b:Pages>10.2139/ssrn.2523863</b:Pages>
-    <b:RefOrder>12</b:RefOrder>
+    <b:RefOrder>13</b:RefOrder>
   </b:Source>
   <b:Source>
     <b:Tag>Aikman19</b:Tag>
@@ -17825,7 +17591,7 @@
     <b:Year>2019</b:Year>
     <b:Publisher>Bank of England</b:Publisher>
     <b:Month>September</b:Month>
-    <b:RefOrder>13</b:RefOrder>
+    <b:RefOrder>14</b:RefOrder>
   </b:Source>
   <b:Source>
     <b:Tag>Pra19</b:Tag>
@@ -17871,7 +17637,7 @@
     </b:Author>
     <b:Volume>19</b:Volume>
     <b:Issue>36</b:Issue>
-    <b:RefOrder>14</b:RefOrder>
+    <b:RefOrder>15</b:RefOrder>
   </b:Source>
   <b:Source>
     <b:Tag>Sua22</b:Tag>
@@ -17893,7 +17659,7 @@
     <b:Pages>10.1016/j.jfs.2022.101008</b:Pages>
     <b:Volume>60</b:Volume>
     <b:Issue>1572-3089</b:Issue>
-    <b:RefOrder>15</b:RefOrder>
+    <b:RefOrder>16</b:RefOrder>
   </b:Source>
   <b:Source>
     <b:Tag>Koo14</b:Tag>
@@ -17919,7 +17685,7 @@
     <b:Pages>101-116, 10.1016/j.euroecorev.2014.07.002</b:Pages>
     <b:Volume>71</b:Volume>
     <b:Issue>0014-2921</b:Issue>
-    <b:RefOrder>5</b:RefOrder>
+    <b:RefOrder>3</b:RefOrder>
   </b:Source>
   <b:Source>
     <b:Tag>Cec21</b:Tag>
@@ -17947,7 +17713,7 @@
     <b:Publisher>ESRB: Advisory Scientific Committee Reports</b:Publisher>
     <b:Month>December</b:Month>
     <b:Issue>11</b:Issue>
-    <b:RefOrder>16</b:RefOrder>
+    <b:RefOrder>17</b:RefOrder>
   </b:Source>
   <b:Source>
     <b:Tag>Cha21</b:Tag>
@@ -17990,7 +17756,7 @@
     <b:Year>2021</b:Year>
     <b:Pages>10.2139/ssrn.3859109</b:Pages>
     <b:Publisher>European Central Bank</b:Publisher>
-    <b:RefOrder>17</b:RefOrder>
+    <b:RefOrder>18</b:RefOrder>
   </b:Source>
   <b:Source>
     <b:Tag>Alam19</b:Tag>
@@ -18040,7 +17806,7 @@
     </b:Author>
     <b:Volume>19</b:Volume>
     <b:Issue>66</b:Issue>
-    <b:RefOrder>1</b:RefOrder>
+    <b:RefOrder>4</b:RefOrder>
   </b:Source>
   <b:Source>
     <b:Tag>Jim17</b:Tag>
@@ -18074,7 +17840,7 @@
     <b:Pages>2126-2177, 10.1086/694289</b:Pages>
     <b:Volume>125</b:Volume>
     <b:Issue>6</b:Issue>
-    <b:RefOrder>18</b:RefOrder>
+    <b:RefOrder>19</b:RefOrder>
   </b:Source>
   <b:Source>
     <b:Tag>Boa17</b:Tag>
@@ -18106,7 +17872,7 @@
         </b:NameList>
       </b:Author>
     </b:Author>
-    <b:RefOrder>19</b:RefOrder>
+    <b:RefOrder>20</b:RefOrder>
   </b:Source>
   <b:Source>
     <b:Tag>Koe78</b:Tag>
@@ -18132,7 +17898,7 @@
     <b:Pages>33, 10.2307/1913643</b:Pages>
     <b:Volume>46</b:Volume>
     <b:Issue>1</b:Issue>
-    <b:RefOrder>3</b:RefOrder>
+    <b:RefOrder>7</b:RefOrder>
   </b:Source>
   <b:Source>
     <b:Tag>Kip22</b:Tag>
@@ -18154,7 +17920,7 @@
     <b:Pages>23-45, 10.31477/rjmf.202201.23</b:Pages>
     <b:Volume>81</b:Volume>
     <b:Issue>1</b:Issue>
-    <b:RefOrder>4</b:RefOrder>
+    <b:RefOrder>8</b:RefOrder>
   </b:Source>
   <b:Source>
     <b:Tag>Hol12</b:Tag>
@@ -18182,7 +17948,7 @@
     <b:JournalName>ECB Working Paper 1426</b:JournalName>
     <b:Year>2012</b:Year>
     <b:Publisher>European Central Bank</b:Publisher>
-    <b:RefOrder>6</b:RefOrder>
+    <b:RefOrder>1</b:RefOrder>
   </b:Source>
   <b:Source>
     <b:Tag>Pla14</b:Tag>
@@ -18214,7 +17980,7 @@
     <b:JournalName>Czech Financial Stability Report 2013/2014</b:JournalName>
     <b:Year>2014</b:Year>
     <b:Publisher>Czech National Bank</b:Publisher>
-    <b:RefOrder>7</b:RefOrder>
+    <b:RefOrder>2</b:RefOrder>
   </b:Source>
   <b:Source>
     <b:Tag>IMF24</b:Tag>
@@ -18231,7 +17997,7 @@
     </b:Author>
     <b:Title>International Financial Statistics</b:Title>
     <b:Year>2024</b:Year>
-    <b:RefOrder>20</b:RefOrder>
+    <b:RefOrder>21</b:RefOrder>
   </b:Source>
   <b:Source>
     <b:Tag>IMF241</b:Tag>
@@ -18248,7 +18014,7 @@
     </b:Author>
     <b:Title>Financial Soundness Indicators</b:Title>
     <b:Year>2024</b:Year>
-    <b:RefOrder>21</b:RefOrder>
+    <b:RefOrder>22</b:RefOrder>
   </b:Source>
   <b:Source>
     <b:Tag>Wor23</b:Tag>
@@ -18266,21 +18032,42 @@
     <b:Title>Global Economic Monitor (GEM) [Data set]</b:Title>
     <b:Year>2023</b:Year>
     <b:Pages>https://databank.worldbank.org/source/global-economic-monitor-(gem)</b:Pages>
-    <b:RefOrder>22</b:RefOrder>
+    <b:RefOrder>23</b:RefOrder>
+  </b:Source>
+  <b:Source>
+    <b:Tag>Jor15</b:Tag>
+    <b:SourceType>JournalArticle</b:SourceType>
+    <b:Guid>{4EF830C3-D7CE-EF47-8F74-DC6FF2AC1812}</b:Guid>
+    <b:Title>Leveraged bubbles</b:Title>
+    <b:JournalName>Journal of Monetary Economics</b:JournalName>
+    <b:Year>2015</b:Year>
+    <b:Pages>S1-S20, 10.1016/j.jmoneco.2015.08.005</b:Pages>
+    <b:Author>
+      <b:Author>
+        <b:NameList>
+          <b:Person>
+            <b:Last>Jordà</b:Last>
+            <b:First>Òscar</b:First>
+          </b:Person>
+          <b:Person>
+            <b:Last>Schularick</b:Last>
+            <b:First>Moritz</b:First>
+          </b:Person>
+          <b:Person>
+            <b:Last>Taylor</b:Last>
+            <b:First>Alan</b:First>
+            <b:Middle>M.</b:Middle>
+          </b:Person>
+        </b:NameList>
+      </b:Author>
+    </b:Author>
+    <b:Volume>76</b:Volume>
+    <b:RefOrder>6</b:RefOrder>
   </b:Source>
 </b:Sources>
 </file>
 
 <file path=customXml/itemProps1.xml><?xml version="1.0" encoding="utf-8"?>
-<ds:datastoreItem xmlns:ds="http://schemas.openxmlformats.org/officeDocument/2006/customXml" ds:itemID="{1BFD7228-1354-4EFB-A4EC-BB725330CC35}">
-  <ds:schemaRefs>
-    <ds:schemaRef ds:uri="http://schemas.microsoft.com/office/2006/metadata/properties"/>
-    <ds:schemaRef ds:uri="http://schemas.microsoft.com/office/infopath/2007/PartnerControls"/>
-  </ds:schemaRefs>
-</ds:datastoreItem>
-</file>
-
-<file path=customXml/itemProps2.xml><?xml version="1.0" encoding="utf-8"?>
 <ds:datastoreItem xmlns:ds="http://schemas.openxmlformats.org/officeDocument/2006/customXml" ds:itemID="{D0E692C2-D0BE-4612-A636-0A340A43F5C4}">
   <ds:schemaRefs>
     <ds:schemaRef ds:uri="http://schemas.microsoft.com/office/2006/metadata/contentType"/>
@@ -18299,6 +18086,15 @@
 </ds:datastoreItem>
 </file>
 
+<file path=customXml/itemProps2.xml><?xml version="1.0" encoding="utf-8"?>
+<ds:datastoreItem xmlns:ds="http://schemas.openxmlformats.org/officeDocument/2006/customXml" ds:itemID="{1BFD7228-1354-4EFB-A4EC-BB725330CC35}">
+  <ds:schemaRefs>
+    <ds:schemaRef ds:uri="http://schemas.microsoft.com/office/2006/metadata/properties"/>
+    <ds:schemaRef ds:uri="http://schemas.microsoft.com/office/infopath/2007/PartnerControls"/>
+  </ds:schemaRefs>
+</ds:datastoreItem>
+</file>
+
 <file path=customXml/itemProps3.xml><?xml version="1.0" encoding="utf-8"?>
 <ds:datastoreItem xmlns:ds="http://schemas.openxmlformats.org/officeDocument/2006/customXml" ds:itemID="{4460A41E-572B-49C8-8C8C-07157C22081B}">
   <ds:schemaRefs>
@@ -18308,7 +18104,7 @@
 </file>
 
 <file path=customXml/itemProps4.xml><?xml version="1.0" encoding="utf-8"?>
-<ds:datastoreItem xmlns:ds="http://schemas.openxmlformats.org/officeDocument/2006/customXml" ds:itemID="{67E1B277-0B5C-044E-B440-94171747D4CD}">
+<ds:datastoreItem xmlns:ds="http://schemas.openxmlformats.org/officeDocument/2006/customXml" ds:itemID="{95979FD3-1FF1-F741-87BD-E5BCB77EF9FF}">
   <ds:schemaRefs>
     <ds:schemaRef ds:uri="http://schemas.openxmlformats.org/officeDocument/2006/bibliography"/>
   </ds:schemaRefs>

</xml_diff>